<commit_message>
KIIS 2026 form draft: one A4 page, metric-named columns
Co-Authored-By: Claude Opus 5.5 <noreply@anthropic.com>
</commit_message>
<xml_diff>
--- a/docs/KIIS2026_GSV_OSM_초고.docx
+++ b/docs/KIIS2026_GSV_OSM_초고.docx
@@ -9,8 +9,8 @@
         <w:tblLook w:firstColumn="1" w:firstRow="1" w:lastColumn="0" w:lastRow="0" w:noHBand="0" w:noVBand="1" w:val="04A0"/>
       </w:tblPr>
       <w:tblGrid>
-        <w:gridCol w:w="5256"/>
-        <w:gridCol w:w="5256"/>
+        <w:gridCol w:w="5162"/>
+        <w:gridCol w:w="5162"/>
       </w:tblGrid>
       <w:tr>
         <w:tc>
@@ -21,7 +21,7 @@
           </w:tcPr>
           <w:p>
             <w:pPr>
-              <w:spacing w:after="40"/>
+              <w:spacing w:after="20" w:before="0" w:line="252" w:lineRule="auto"/>
               <w:jc w:val="center"/>
             </w:pPr>
             <w:r>
@@ -40,7 +40,7 @@
           </w:tcPr>
           <w:p>
             <w:pPr>
-              <w:spacing w:after="40"/>
+              <w:spacing w:after="20" w:before="0" w:line="252" w:lineRule="auto"/>
             </w:pPr>
             <w:r>
               <w:rPr>
@@ -62,7 +62,7 @@
           </w:tcPr>
           <w:p>
             <w:pPr>
-              <w:spacing w:after="40"/>
+              <w:spacing w:after="20" w:before="0" w:line="252" w:lineRule="auto"/>
               <w:jc w:val="center"/>
             </w:pPr>
             <w:r>
@@ -81,7 +81,7 @@
           </w:tcPr>
           <w:p>
             <w:pPr>
-              <w:spacing w:after="40"/>
+              <w:spacing w:after="20" w:before="0" w:line="252" w:lineRule="auto"/>
             </w:pPr>
             <w:r>
               <w:rPr>
@@ -103,7 +103,7 @@
           </w:tcPr>
           <w:p>
             <w:pPr>
-              <w:spacing w:after="40"/>
+              <w:spacing w:after="20" w:before="0" w:line="252" w:lineRule="auto"/>
               <w:jc w:val="center"/>
             </w:pPr>
             <w:r>
@@ -126,7 +126,7 @@
           </w:tcPr>
           <w:p>
             <w:pPr>
-              <w:spacing w:after="40"/>
+              <w:spacing w:after="20" w:before="0" w:line="252" w:lineRule="auto"/>
             </w:pPr>
             <w:r>
               <w:rPr>
@@ -148,7 +148,7 @@
           </w:tcPr>
           <w:p>
             <w:pPr>
-              <w:spacing w:after="40"/>
+              <w:spacing w:after="20" w:before="0" w:line="252" w:lineRule="auto"/>
               <w:jc w:val="center"/>
             </w:pPr>
             <w:r>
@@ -167,7 +167,7 @@
           </w:tcPr>
           <w:p>
             <w:pPr>
-              <w:spacing w:after="40"/>
+              <w:spacing w:after="20" w:before="0" w:line="252" w:lineRule="auto"/>
             </w:pPr>
             <w:r>
               <w:rPr>
@@ -189,7 +189,7 @@
           </w:tcPr>
           <w:p>
             <w:pPr>
-              <w:spacing w:after="40"/>
+              <w:spacing w:after="20" w:before="0" w:line="252" w:lineRule="auto"/>
               <w:jc w:val="center"/>
             </w:pPr>
             <w:r>
@@ -208,54 +208,54 @@
           </w:tcPr>
           <w:p>
             <w:pPr>
-              <w:spacing w:after="40"/>
+              <w:spacing w:after="20" w:before="0" w:line="252" w:lineRule="auto"/>
             </w:pPr>
             <w:r>
               <w:rPr>
                 <w:rFonts w:ascii="맑은 고딕" w:hAnsi="맑은 고딕" w:eastAsia="맑은 고딕"/>
                 <w:b w:val="0"/>
-                <w:sz w:val="20"/>
+                <w:sz w:val="18"/>
               </w:rPr>
-              <w:t>- 모듈형 프레임워크: 간판 검출 → 단어 박스 검출 → 라인 병합 → OCR → VLM 교정 → 의미 태깅 → OSM 태그(name, amenity)</w:t>
+              <w:t>- 모듈형 프레임워크: 간판 검출 → 단어 박스 검출 → 라인 병합 → OCR → VLM 교정 → 의미 태깅 → OSM 태그</w:t>
             </w:r>
           </w:p>
           <w:p>
             <w:pPr>
-              <w:spacing w:after="40"/>
+              <w:spacing w:after="20" w:before="0" w:line="252" w:lineRule="auto"/>
             </w:pPr>
             <w:r>
               <w:rPr>
                 <w:rFonts w:ascii="맑은 고딕" w:hAnsi="맑은 고딕" w:eastAsia="맑은 고딕"/>
                 <w:b w:val="0"/>
-                <w:sz w:val="20"/>
+                <w:sz w:val="18"/>
               </w:rPr>
-              <w:t>- 데이터: GSV 이미지 298장(강남 99 · 브루클린 99 · 수원 100), 정답 간판 453 · 단어 박스 1,467 · OCR 592 라인</w:t>
+              <w:t>- 데이터: GSV 298장(강남 99·브루클린 99·수원 100), 간판 453 · 단어 박스 1,467 · OCR 592 라인 · 태깅 377</w:t>
             </w:r>
           </w:p>
           <w:p>
             <w:pPr>
-              <w:spacing w:after="40"/>
+              <w:spacing w:after="20" w:before="0" w:line="252" w:lineRule="auto"/>
             </w:pPr>
             <w:r>
               <w:rPr>
                 <w:rFonts w:ascii="맑은 고딕" w:hAnsi="맑은 고딕" w:eastAsia="맑은 고딕"/>
                 <w:b w:val="0"/>
-                <w:sz w:val="20"/>
+                <w:sz w:val="18"/>
               </w:rPr>
-              <w:t>- 모듈별 비교 후 두 파이프라인(단어 박스 검출 A: YOLO26x, B: YOLOv5x)으로 전 과정 평가</w:t>
+              <w:t>- 파이프라인 A: 단어 박스 검출 YOLO26x, B: YOLOv5x (두 검출기 성능 차이가 없어 둘 다 평가)</w:t>
             </w:r>
           </w:p>
           <w:p>
             <w:pPr>
-              <w:spacing w:after="40"/>
+              <w:spacing w:after="20" w:before="0" w:line="252" w:lineRule="auto"/>
             </w:pPr>
             <w:r>
               <w:rPr>
                 <w:rFonts w:ascii="맑은 고딕" w:hAnsi="맑은 고딕" w:eastAsia="맑은 고딕"/>
                 <w:b w:val="0"/>
-                <w:sz w:val="20"/>
+                <w:sz w:val="18"/>
               </w:rPr>
-              <w:t>[간판 검출: GSV 298장, group-aware 5-fold, AP@0.5]</w:t>
+              <w:t>[검출기 3종: 간판 검출(GSV, group-aware 5-fold) · 단어 박스 검출]</w:t>
             </w:r>
           </w:p>
           <w:tbl>
@@ -279,14 +279,14 @@
                 </w:tcPr>
                 <w:p>
                   <w:pPr>
-                    <w:spacing w:after="40"/>
+                    <w:spacing w:after="20" w:before="0" w:line="252" w:lineRule="auto"/>
                     <w:jc w:val="center"/>
                   </w:pPr>
                   <w:r>
                     <w:rPr>
                       <w:rFonts w:ascii="맑은 고딕" w:hAnsi="맑은 고딕" w:eastAsia="맑은 고딕"/>
                       <w:b/>
-                      <w:sz w:val="18"/>
+                      <w:sz w:val="17"/>
                     </w:rPr>
                     <w:t>모델</w:t>
                   </w:r>
@@ -299,16 +299,18 @@
                 </w:tcPr>
                 <w:p>
                   <w:pPr>
-                    <w:spacing w:after="40"/>
+                    <w:spacing w:after="20" w:before="0" w:line="252" w:lineRule="auto"/>
                     <w:jc w:val="center"/>
                   </w:pPr>
                   <w:r>
                     <w:rPr>
                       <w:rFonts w:ascii="맑은 고딕" w:hAnsi="맑은 고딕" w:eastAsia="맑은 고딕"/>
                       <w:b/>
-                      <w:sz w:val="18"/>
+                      <w:sz w:val="17"/>
                     </w:rPr>
-                    <w:t>강남</w:t>
+                    <w:t>간판 검출</w:t>
+                    <w:br/>
+                    <w:t>AP@0.5</w:t>
                   </w:r>
                 </w:p>
               </w:tc>
@@ -319,16 +321,18 @@
                 </w:tcPr>
                 <w:p>
                   <w:pPr>
-                    <w:spacing w:after="40"/>
+                    <w:spacing w:after="20" w:before="0" w:line="252" w:lineRule="auto"/>
                     <w:jc w:val="center"/>
                   </w:pPr>
                   <w:r>
                     <w:rPr>
                       <w:rFonts w:ascii="맑은 고딕" w:hAnsi="맑은 고딕" w:eastAsia="맑은 고딕"/>
                       <w:b/>
-                      <w:sz w:val="18"/>
+                      <w:sz w:val="17"/>
                     </w:rPr>
-                    <w:t>브루클린</w:t>
+                    <w:t>단어 박스 AP@0.5</w:t>
+                    <w:br/>
+                    <w:t>(AI Hub 시험셋)</w:t>
                   </w:r>
                 </w:p>
               </w:tc>
@@ -339,16 +343,18 @@
                 </w:tcPr>
                 <w:p>
                   <w:pPr>
-                    <w:spacing w:after="40"/>
+                    <w:spacing w:after="20" w:before="0" w:line="252" w:lineRule="auto"/>
                     <w:jc w:val="center"/>
                   </w:pPr>
                   <w:r>
                     <w:rPr>
                       <w:rFonts w:ascii="맑은 고딕" w:hAnsi="맑은 고딕" w:eastAsia="맑은 고딕"/>
                       <w:b/>
-                      <w:sz w:val="18"/>
+                      <w:sz w:val="17"/>
                     </w:rPr>
-                    <w:t>수원</w:t>
+                    <w:t>단어 박스 AP@0.5</w:t>
+                    <w:br/>
+                    <w:t>(GSV 정답 간판)</w:t>
                   </w:r>
                 </w:p>
               </w:tc>
@@ -359,16 +365,18 @@
                 </w:tcPr>
                 <w:p>
                   <w:pPr>
-                    <w:spacing w:after="40"/>
+                    <w:spacing w:after="20" w:before="0" w:line="252" w:lineRule="auto"/>
                     <w:jc w:val="center"/>
                   </w:pPr>
                   <w:r>
                     <w:rPr>
                       <w:rFonts w:ascii="맑은 고딕" w:hAnsi="맑은 고딕" w:eastAsia="맑은 고딕"/>
                       <w:b/>
-                      <w:sz w:val="18"/>
+                      <w:sz w:val="17"/>
                     </w:rPr>
-                    <w:t>전체</w:t>
+                    <w:t>단어 박스 AP@0.5</w:t>
+                    <w:br/>
+                    <w:t>(간판 검출 연쇄)</w:t>
                   </w:r>
                 </w:p>
               </w:tc>
@@ -380,13 +388,13 @@
                 </w:tcPr>
                 <w:p>
                   <w:pPr>
-                    <w:spacing w:after="40"/>
+                    <w:spacing w:after="20" w:before="0" w:line="252" w:lineRule="auto"/>
                   </w:pPr>
                   <w:r>
                     <w:rPr>
                       <w:rFonts w:ascii="맑은 고딕" w:hAnsi="맑은 고딕" w:eastAsia="맑은 고딕"/>
                       <w:b/>
-                      <w:sz w:val="18"/>
+                      <w:sz w:val="17"/>
                     </w:rPr>
                     <w:t>YOLO26x</w:t>
                   </w:r>
@@ -398,16 +406,16 @@
                 </w:tcPr>
                 <w:p>
                   <w:pPr>
-                    <w:spacing w:after="40"/>
+                    <w:spacing w:after="20" w:before="0" w:line="252" w:lineRule="auto"/>
                     <w:jc w:val="center"/>
                   </w:pPr>
                   <w:r>
                     <w:rPr>
                       <w:rFonts w:ascii="맑은 고딕" w:hAnsi="맑은 고딕" w:eastAsia="맑은 고딕"/>
                       <w:b/>
-                      <w:sz w:val="18"/>
+                      <w:sz w:val="17"/>
                     </w:rPr>
-                    <w:t>0.833</w:t>
+                    <w:t>0.860</w:t>
                   </w:r>
                 </w:p>
               </w:tc>
@@ -417,16 +425,16 @@
                 </w:tcPr>
                 <w:p>
                   <w:pPr>
-                    <w:spacing w:after="40"/>
+                    <w:spacing w:after="20" w:before="0" w:line="252" w:lineRule="auto"/>
                     <w:jc w:val="center"/>
                   </w:pPr>
                   <w:r>
                     <w:rPr>
                       <w:rFonts w:ascii="맑은 고딕" w:hAnsi="맑은 고딕" w:eastAsia="맑은 고딕"/>
                       <w:b/>
-                      <w:sz w:val="18"/>
+                      <w:sz w:val="17"/>
                     </w:rPr>
-                    <w:t>0.874</w:t>
+                    <w:t>0.822</w:t>
                   </w:r>
                 </w:p>
               </w:tc>
@@ -436,16 +444,16 @@
                 </w:tcPr>
                 <w:p>
                   <w:pPr>
-                    <w:spacing w:after="40"/>
+                    <w:spacing w:after="20" w:before="0" w:line="252" w:lineRule="auto"/>
                     <w:jc w:val="center"/>
                   </w:pPr>
                   <w:r>
                     <w:rPr>
                       <w:rFonts w:ascii="맑은 고딕" w:hAnsi="맑은 고딕" w:eastAsia="맑은 고딕"/>
                       <w:b/>
-                      <w:sz w:val="18"/>
+                      <w:sz w:val="17"/>
                     </w:rPr>
-                    <w:t>0.879</w:t>
+                    <w:t>0.892</w:t>
                   </w:r>
                 </w:p>
               </w:tc>
@@ -455,16 +463,16 @@
                 </w:tcPr>
                 <w:p>
                   <w:pPr>
-                    <w:spacing w:after="40"/>
+                    <w:spacing w:after="20" w:before="0" w:line="252" w:lineRule="auto"/>
                     <w:jc w:val="center"/>
                   </w:pPr>
                   <w:r>
                     <w:rPr>
                       <w:rFonts w:ascii="맑은 고딕" w:hAnsi="맑은 고딕" w:eastAsia="맑은 고딕"/>
                       <w:b/>
-                      <w:sz w:val="18"/>
+                      <w:sz w:val="17"/>
                     </w:rPr>
-                    <w:t>0.860</w:t>
+                    <w:t>0.740</w:t>
                   </w:r>
                 </w:p>
               </w:tc>
@@ -476,13 +484,109 @@
                 </w:tcPr>
                 <w:p>
                   <w:pPr>
-                    <w:spacing w:after="40"/>
+                    <w:spacing w:after="20" w:before="0" w:line="252" w:lineRule="auto"/>
                   </w:pPr>
                   <w:r>
                     <w:rPr>
                       <w:rFonts w:ascii="맑은 고딕" w:hAnsi="맑은 고딕" w:eastAsia="맑은 고딕"/>
                       <w:b w:val="0"/>
-                      <w:sz w:val="18"/>
+                      <w:sz w:val="17"/>
+                    </w:rPr>
+                    <w:t>YOLOv5x</w:t>
+                  </w:r>
+                </w:p>
+              </w:tc>
+              <w:tc>
+                <w:tcPr>
+                  <w:tcW w:type="dxa" w:w="1800"/>
+                </w:tcPr>
+                <w:p>
+                  <w:pPr>
+                    <w:spacing w:after="20" w:before="0" w:line="252" w:lineRule="auto"/>
+                    <w:jc w:val="center"/>
+                  </w:pPr>
+                  <w:r>
+                    <w:rPr>
+                      <w:rFonts w:ascii="맑은 고딕" w:hAnsi="맑은 고딕" w:eastAsia="맑은 고딕"/>
+                      <w:b w:val="0"/>
+                      <w:sz w:val="17"/>
+                    </w:rPr>
+                    <w:t>0.806</w:t>
+                  </w:r>
+                </w:p>
+              </w:tc>
+              <w:tc>
+                <w:tcPr>
+                  <w:tcW w:type="dxa" w:w="1800"/>
+                </w:tcPr>
+                <w:p>
+                  <w:pPr>
+                    <w:spacing w:after="20" w:before="0" w:line="252" w:lineRule="auto"/>
+                    <w:jc w:val="center"/>
+                  </w:pPr>
+                  <w:r>
+                    <w:rPr>
+                      <w:rFonts w:ascii="맑은 고딕" w:hAnsi="맑은 고딕" w:eastAsia="맑은 고딕"/>
+                      <w:b w:val="0"/>
+                      <w:sz w:val="17"/>
+                    </w:rPr>
+                    <w:t>0.809</w:t>
+                  </w:r>
+                </w:p>
+              </w:tc>
+              <w:tc>
+                <w:tcPr>
+                  <w:tcW w:type="dxa" w:w="1800"/>
+                </w:tcPr>
+                <w:p>
+                  <w:pPr>
+                    <w:spacing w:after="20" w:before="0" w:line="252" w:lineRule="auto"/>
+                    <w:jc w:val="center"/>
+                  </w:pPr>
+                  <w:r>
+                    <w:rPr>
+                      <w:rFonts w:ascii="맑은 고딕" w:hAnsi="맑은 고딕" w:eastAsia="맑은 고딕"/>
+                      <w:b w:val="0"/>
+                      <w:sz w:val="17"/>
+                    </w:rPr>
+                    <w:t>0.893</w:t>
+                  </w:r>
+                </w:p>
+              </w:tc>
+              <w:tc>
+                <w:tcPr>
+                  <w:tcW w:type="dxa" w:w="1800"/>
+                </w:tcPr>
+                <w:p>
+                  <w:pPr>
+                    <w:spacing w:after="20" w:before="0" w:line="252" w:lineRule="auto"/>
+                    <w:jc w:val="center"/>
+                  </w:pPr>
+                  <w:r>
+                    <w:rPr>
+                      <w:rFonts w:ascii="맑은 고딕" w:hAnsi="맑은 고딕" w:eastAsia="맑은 고딕"/>
+                      <w:b w:val="0"/>
+                      <w:sz w:val="17"/>
+                    </w:rPr>
+                    <w:t>0.745</w:t>
+                  </w:r>
+                </w:p>
+              </w:tc>
+            </w:tr>
+            <w:tr>
+              <w:tc>
+                <w:tcPr>
+                  <w:tcW w:type="dxa" w:w="1800"/>
+                </w:tcPr>
+                <w:p>
+                  <w:pPr>
+                    <w:spacing w:after="20" w:before="0" w:line="252" w:lineRule="auto"/>
+                  </w:pPr>
+                  <w:r>
+                    <w:rPr>
+                      <w:rFonts w:ascii="맑은 고딕" w:hAnsi="맑은 고딕" w:eastAsia="맑은 고딕"/>
+                      <w:b w:val="0"/>
+                      <w:sz w:val="17"/>
                     </w:rPr>
                     <w:t>Faster R-CNN</w:t>
                   </w:r>
@@ -494,16 +598,16 @@
                 </w:tcPr>
                 <w:p>
                   <w:pPr>
-                    <w:spacing w:after="40"/>
+                    <w:spacing w:after="20" w:before="0" w:line="252" w:lineRule="auto"/>
                     <w:jc w:val="center"/>
                   </w:pPr>
                   <w:r>
                     <w:rPr>
                       <w:rFonts w:ascii="맑은 고딕" w:hAnsi="맑은 고딕" w:eastAsia="맑은 고딕"/>
                       <w:b w:val="0"/>
-                      <w:sz w:val="18"/>
+                      <w:sz w:val="17"/>
                     </w:rPr>
-                    <w:t>0.826</w:t>
+                    <w:t>0.854</w:t>
                   </w:r>
                 </w:p>
               </w:tc>
@@ -513,16 +617,16 @@
                 </w:tcPr>
                 <w:p>
                   <w:pPr>
-                    <w:spacing w:after="40"/>
+                    <w:spacing w:after="20" w:before="0" w:line="252" w:lineRule="auto"/>
                     <w:jc w:val="center"/>
                   </w:pPr>
                   <w:r>
                     <w:rPr>
                       <w:rFonts w:ascii="맑은 고딕" w:hAnsi="맑은 고딕" w:eastAsia="맑은 고딕"/>
                       <w:b w:val="0"/>
-                      <w:sz w:val="18"/>
+                      <w:sz w:val="17"/>
                     </w:rPr>
-                    <w:t>0.871</w:t>
+                    <w:t>0.715</w:t>
                   </w:r>
                 </w:p>
               </w:tc>
@@ -532,16 +636,16 @@
                 </w:tcPr>
                 <w:p>
                   <w:pPr>
-                    <w:spacing w:after="40"/>
+                    <w:spacing w:after="20" w:before="0" w:line="252" w:lineRule="auto"/>
                     <w:jc w:val="center"/>
                   </w:pPr>
                   <w:r>
                     <w:rPr>
                       <w:rFonts w:ascii="맑은 고딕" w:hAnsi="맑은 고딕" w:eastAsia="맑은 고딕"/>
                       <w:b w:val="0"/>
-                      <w:sz w:val="18"/>
+                      <w:sz w:val="17"/>
                     </w:rPr>
-                    <w:t>0.884</w:t>
+                    <w:t>0.827</w:t>
                   </w:r>
                 </w:p>
               </w:tc>
@@ -551,455 +655,14 @@
                 </w:tcPr>
                 <w:p>
                   <w:pPr>
-                    <w:spacing w:after="40"/>
+                    <w:spacing w:after="20" w:before="0" w:line="252" w:lineRule="auto"/>
                     <w:jc w:val="center"/>
                   </w:pPr>
                   <w:r>
                     <w:rPr>
                       <w:rFonts w:ascii="맑은 고딕" w:hAnsi="맑은 고딕" w:eastAsia="맑은 고딕"/>
                       <w:b w:val="0"/>
-                      <w:sz w:val="18"/>
-                    </w:rPr>
-                    <w:t>0.854</w:t>
-                  </w:r>
-                </w:p>
-              </w:tc>
-            </w:tr>
-            <w:tr>
-              <w:tc>
-                <w:tcPr>
-                  <w:tcW w:type="dxa" w:w="1800"/>
-                </w:tcPr>
-                <w:p>
-                  <w:pPr>
-                    <w:spacing w:after="40"/>
-                  </w:pPr>
-                  <w:r>
-                    <w:rPr>
-                      <w:rFonts w:ascii="맑은 고딕" w:hAnsi="맑은 고딕" w:eastAsia="맑은 고딕"/>
-                      <w:b w:val="0"/>
-                      <w:sz w:val="18"/>
-                    </w:rPr>
-                    <w:t>YOLOv5x</w:t>
-                  </w:r>
-                </w:p>
-              </w:tc>
-              <w:tc>
-                <w:tcPr>
-                  <w:tcW w:type="dxa" w:w="1800"/>
-                </w:tcPr>
-                <w:p>
-                  <w:pPr>
-                    <w:spacing w:after="40"/>
-                    <w:jc w:val="center"/>
-                  </w:pPr>
-                  <w:r>
-                    <w:rPr>
-                      <w:rFonts w:ascii="맑은 고딕" w:hAnsi="맑은 고딕" w:eastAsia="맑은 고딕"/>
-                      <w:b w:val="0"/>
-                      <w:sz w:val="18"/>
-                    </w:rPr>
-                    <w:t>0.815</w:t>
-                  </w:r>
-                </w:p>
-              </w:tc>
-              <w:tc>
-                <w:tcPr>
-                  <w:tcW w:type="dxa" w:w="1800"/>
-                </w:tcPr>
-                <w:p>
-                  <w:pPr>
-                    <w:spacing w:after="40"/>
-                    <w:jc w:val="center"/>
-                  </w:pPr>
-                  <w:r>
-                    <w:rPr>
-                      <w:rFonts w:ascii="맑은 고딕" w:hAnsi="맑은 고딕" w:eastAsia="맑은 고딕"/>
-                      <w:b w:val="0"/>
-                      <w:sz w:val="18"/>
-                    </w:rPr>
-                    <w:t>0.856</w:t>
-                  </w:r>
-                </w:p>
-              </w:tc>
-              <w:tc>
-                <w:tcPr>
-                  <w:tcW w:type="dxa" w:w="1800"/>
-                </w:tcPr>
-                <w:p>
-                  <w:pPr>
-                    <w:spacing w:after="40"/>
-                    <w:jc w:val="center"/>
-                  </w:pPr>
-                  <w:r>
-                    <w:rPr>
-                      <w:rFonts w:ascii="맑은 고딕" w:hAnsi="맑은 고딕" w:eastAsia="맑은 고딕"/>
-                      <w:b w:val="0"/>
-                      <w:sz w:val="18"/>
-                    </w:rPr>
-                    <w:t>0.744</w:t>
-                  </w:r>
-                </w:p>
-              </w:tc>
-              <w:tc>
-                <w:tcPr>
-                  <w:tcW w:type="dxa" w:w="1800"/>
-                </w:tcPr>
-                <w:p>
-                  <w:pPr>
-                    <w:spacing w:after="40"/>
-                    <w:jc w:val="center"/>
-                  </w:pPr>
-                  <w:r>
-                    <w:rPr>
-                      <w:rFonts w:ascii="맑은 고딕" w:hAnsi="맑은 고딕" w:eastAsia="맑은 고딕"/>
-                      <w:b w:val="0"/>
-                      <w:sz w:val="18"/>
-                    </w:rPr>
-                    <w:t>0.806</w:t>
-                  </w:r>
-                </w:p>
-              </w:tc>
-            </w:tr>
-          </w:tbl>
-          <w:p/>
-          <w:p>
-            <w:pPr>
-              <w:spacing w:after="40"/>
-            </w:pPr>
-          </w:p>
-          <w:p>
-            <w:pPr>
-              <w:spacing w:after="40"/>
-            </w:pPr>
-            <w:r>
-              <w:rPr>
-                <w:rFonts w:ascii="맑은 고딕" w:hAnsi="맑은 고딕" w:eastAsia="맑은 고딕"/>
-                <w:b w:val="0"/>
-                <w:sz w:val="20"/>
-              </w:rPr>
-              <w:t>[단어 박스 검출: AP@0.5]</w:t>
-            </w:r>
-          </w:p>
-          <w:tbl>
-            <w:tblPr>
-              <w:tblStyle w:val="TableGrid"/>
-              <w:tblW w:type="auto" w:w="0"/>
-              <w:tblLook w:firstColumn="1" w:firstRow="1" w:lastColumn="0" w:lastRow="0" w:noHBand="0" w:noVBand="1" w:val="04A0"/>
-            </w:tblPr>
-            <w:tblGrid>
-              <w:gridCol w:w="2250"/>
-              <w:gridCol w:w="2250"/>
-              <w:gridCol w:w="2250"/>
-              <w:gridCol w:w="2250"/>
-            </w:tblGrid>
-            <w:tr>
-              <w:tc>
-                <w:tcPr>
-                  <w:tcW w:type="dxa" w:w="2250"/>
-                  <w:shd w:val="clear" w:color="auto" w:fill="F3F4F6"/>
-                </w:tcPr>
-                <w:p>
-                  <w:pPr>
-                    <w:spacing w:after="40"/>
-                    <w:jc w:val="center"/>
-                  </w:pPr>
-                  <w:r>
-                    <w:rPr>
-                      <w:rFonts w:ascii="맑은 고딕" w:hAnsi="맑은 고딕" w:eastAsia="맑은 고딕"/>
-                      <w:b/>
-                      <w:sz w:val="18"/>
-                    </w:rPr>
-                    <w:t>모델</w:t>
-                  </w:r>
-                </w:p>
-              </w:tc>
-              <w:tc>
-                <w:tcPr>
-                  <w:tcW w:type="dxa" w:w="2250"/>
-                  <w:shd w:val="clear" w:color="auto" w:fill="F3F4F6"/>
-                </w:tcPr>
-                <w:p>
-                  <w:pPr>
-                    <w:spacing w:after="40"/>
-                    <w:jc w:val="center"/>
-                  </w:pPr>
-                  <w:r>
-                    <w:rPr>
-                      <w:rFonts w:ascii="맑은 고딕" w:hAnsi="맑은 고딕" w:eastAsia="맑은 고딕"/>
-                      <w:b/>
-                      <w:sz w:val="18"/>
-                    </w:rPr>
-                    <w:t>AI Hub 시험셋</w:t>
-                  </w:r>
-                </w:p>
-              </w:tc>
-              <w:tc>
-                <w:tcPr>
-                  <w:tcW w:type="dxa" w:w="2250"/>
-                  <w:shd w:val="clear" w:color="auto" w:fill="F3F4F6"/>
-                </w:tcPr>
-                <w:p>
-                  <w:pPr>
-                    <w:spacing w:after="40"/>
-                    <w:jc w:val="center"/>
-                  </w:pPr>
-                  <w:r>
-                    <w:rPr>
-                      <w:rFonts w:ascii="맑은 고딕" w:hAnsi="맑은 고딕" w:eastAsia="맑은 고딕"/>
-                      <w:b/>
-                      <w:sz w:val="18"/>
-                    </w:rPr>
-                    <w:t>GSV 정답 간판 위</w:t>
-                  </w:r>
-                </w:p>
-              </w:tc>
-              <w:tc>
-                <w:tcPr>
-                  <w:tcW w:type="dxa" w:w="2250"/>
-                  <w:shd w:val="clear" w:color="auto" w:fill="F3F4F6"/>
-                </w:tcPr>
-                <w:p>
-                  <w:pPr>
-                    <w:spacing w:after="40"/>
-                    <w:jc w:val="center"/>
-                  </w:pPr>
-                  <w:r>
-                    <w:rPr>
-                      <w:rFonts w:ascii="맑은 고딕" w:hAnsi="맑은 고딕" w:eastAsia="맑은 고딕"/>
-                      <w:b/>
-                      <w:sz w:val="18"/>
-                    </w:rPr>
-                    <w:t>연쇄 (간판 검출 → 단어 검출)</w:t>
-                  </w:r>
-                </w:p>
-              </w:tc>
-            </w:tr>
-            <w:tr>
-              <w:tc>
-                <w:tcPr>
-                  <w:tcW w:type="dxa" w:w="2250"/>
-                </w:tcPr>
-                <w:p>
-                  <w:pPr>
-                    <w:spacing w:after="40"/>
-                  </w:pPr>
-                  <w:r>
-                    <w:rPr>
-                      <w:rFonts w:ascii="맑은 고딕" w:hAnsi="맑은 고딕" w:eastAsia="맑은 고딕"/>
-                      <w:b/>
-                      <w:sz w:val="18"/>
-                    </w:rPr>
-                    <w:t>YOLO26x</w:t>
-                  </w:r>
-                </w:p>
-              </w:tc>
-              <w:tc>
-                <w:tcPr>
-                  <w:tcW w:type="dxa" w:w="2250"/>
-                </w:tcPr>
-                <w:p>
-                  <w:pPr>
-                    <w:spacing w:after="40"/>
-                    <w:jc w:val="center"/>
-                  </w:pPr>
-                  <w:r>
-                    <w:rPr>
-                      <w:rFonts w:ascii="맑은 고딕" w:hAnsi="맑은 고딕" w:eastAsia="맑은 고딕"/>
-                      <w:b/>
-                      <w:sz w:val="18"/>
-                    </w:rPr>
-                    <w:t>0.822</w:t>
-                  </w:r>
-                </w:p>
-              </w:tc>
-              <w:tc>
-                <w:tcPr>
-                  <w:tcW w:type="dxa" w:w="2250"/>
-                </w:tcPr>
-                <w:p>
-                  <w:pPr>
-                    <w:spacing w:after="40"/>
-                    <w:jc w:val="center"/>
-                  </w:pPr>
-                  <w:r>
-                    <w:rPr>
-                      <w:rFonts w:ascii="맑은 고딕" w:hAnsi="맑은 고딕" w:eastAsia="맑은 고딕"/>
-                      <w:b/>
-                      <w:sz w:val="18"/>
-                    </w:rPr>
-                    <w:t>0.892</w:t>
-                  </w:r>
-                </w:p>
-              </w:tc>
-              <w:tc>
-                <w:tcPr>
-                  <w:tcW w:type="dxa" w:w="2250"/>
-                </w:tcPr>
-                <w:p>
-                  <w:pPr>
-                    <w:spacing w:after="40"/>
-                    <w:jc w:val="center"/>
-                  </w:pPr>
-                  <w:r>
-                    <w:rPr>
-                      <w:rFonts w:ascii="맑은 고딕" w:hAnsi="맑은 고딕" w:eastAsia="맑은 고딕"/>
-                      <w:b/>
-                      <w:sz w:val="18"/>
-                    </w:rPr>
-                    <w:t>0.740</w:t>
-                  </w:r>
-                </w:p>
-              </w:tc>
-            </w:tr>
-            <w:tr>
-              <w:tc>
-                <w:tcPr>
-                  <w:tcW w:type="dxa" w:w="2250"/>
-                </w:tcPr>
-                <w:p>
-                  <w:pPr>
-                    <w:spacing w:after="40"/>
-                  </w:pPr>
-                  <w:r>
-                    <w:rPr>
-                      <w:rFonts w:ascii="맑은 고딕" w:hAnsi="맑은 고딕" w:eastAsia="맑은 고딕"/>
-                      <w:b/>
-                      <w:sz w:val="18"/>
-                    </w:rPr>
-                    <w:t>YOLOv5x</w:t>
-                  </w:r>
-                </w:p>
-              </w:tc>
-              <w:tc>
-                <w:tcPr>
-                  <w:tcW w:type="dxa" w:w="2250"/>
-                </w:tcPr>
-                <w:p>
-                  <w:pPr>
-                    <w:spacing w:after="40"/>
-                    <w:jc w:val="center"/>
-                  </w:pPr>
-                  <w:r>
-                    <w:rPr>
-                      <w:rFonts w:ascii="맑은 고딕" w:hAnsi="맑은 고딕" w:eastAsia="맑은 고딕"/>
-                      <w:b/>
-                      <w:sz w:val="18"/>
-                    </w:rPr>
-                    <w:t>0.809</w:t>
-                  </w:r>
-                </w:p>
-              </w:tc>
-              <w:tc>
-                <w:tcPr>
-                  <w:tcW w:type="dxa" w:w="2250"/>
-                </w:tcPr>
-                <w:p>
-                  <w:pPr>
-                    <w:spacing w:after="40"/>
-                    <w:jc w:val="center"/>
-                  </w:pPr>
-                  <w:r>
-                    <w:rPr>
-                      <w:rFonts w:ascii="맑은 고딕" w:hAnsi="맑은 고딕" w:eastAsia="맑은 고딕"/>
-                      <w:b/>
-                      <w:sz w:val="18"/>
-                    </w:rPr>
-                    <w:t>0.893</w:t>
-                  </w:r>
-                </w:p>
-              </w:tc>
-              <w:tc>
-                <w:tcPr>
-                  <w:tcW w:type="dxa" w:w="2250"/>
-                </w:tcPr>
-                <w:p>
-                  <w:pPr>
-                    <w:spacing w:after="40"/>
-                    <w:jc w:val="center"/>
-                  </w:pPr>
-                  <w:r>
-                    <w:rPr>
-                      <w:rFonts w:ascii="맑은 고딕" w:hAnsi="맑은 고딕" w:eastAsia="맑은 고딕"/>
-                      <w:b/>
-                      <w:sz w:val="18"/>
-                    </w:rPr>
-                    <w:t>0.745</w:t>
-                  </w:r>
-                </w:p>
-              </w:tc>
-            </w:tr>
-            <w:tr>
-              <w:tc>
-                <w:tcPr>
-                  <w:tcW w:type="dxa" w:w="2250"/>
-                </w:tcPr>
-                <w:p>
-                  <w:pPr>
-                    <w:spacing w:after="40"/>
-                  </w:pPr>
-                  <w:r>
-                    <w:rPr>
-                      <w:rFonts w:ascii="맑은 고딕" w:hAnsi="맑은 고딕" w:eastAsia="맑은 고딕"/>
-                      <w:b w:val="0"/>
-                      <w:sz w:val="18"/>
-                    </w:rPr>
-                    <w:t>Faster R-CNN</w:t>
-                  </w:r>
-                </w:p>
-              </w:tc>
-              <w:tc>
-                <w:tcPr>
-                  <w:tcW w:type="dxa" w:w="2250"/>
-                </w:tcPr>
-                <w:p>
-                  <w:pPr>
-                    <w:spacing w:after="40"/>
-                    <w:jc w:val="center"/>
-                  </w:pPr>
-                  <w:r>
-                    <w:rPr>
-                      <w:rFonts w:ascii="맑은 고딕" w:hAnsi="맑은 고딕" w:eastAsia="맑은 고딕"/>
-                      <w:b w:val="0"/>
-                      <w:sz w:val="18"/>
-                    </w:rPr>
-                    <w:t>0.715</w:t>
-                  </w:r>
-                </w:p>
-              </w:tc>
-              <w:tc>
-                <w:tcPr>
-                  <w:tcW w:type="dxa" w:w="2250"/>
-                </w:tcPr>
-                <w:p>
-                  <w:pPr>
-                    <w:spacing w:after="40"/>
-                    <w:jc w:val="center"/>
-                  </w:pPr>
-                  <w:r>
-                    <w:rPr>
-                      <w:rFonts w:ascii="맑은 고딕" w:hAnsi="맑은 고딕" w:eastAsia="맑은 고딕"/>
-                      <w:b w:val="0"/>
-                      <w:sz w:val="18"/>
-                    </w:rPr>
-                    <w:t>0.827</w:t>
-                  </w:r>
-                </w:p>
-              </w:tc>
-              <w:tc>
-                <w:tcPr>
-                  <w:tcW w:type="dxa" w:w="2250"/>
-                </w:tcPr>
-                <w:p>
-                  <w:pPr>
-                    <w:spacing w:after="40"/>
-                    <w:jc w:val="center"/>
-                  </w:pPr>
-                  <w:r>
-                    <w:rPr>
-                      <w:rFonts w:ascii="맑은 고딕" w:hAnsi="맑은 고딕" w:eastAsia="맑은 고딕"/>
-                      <w:b w:val="0"/>
-                      <w:sz w:val="18"/>
+                      <w:sz w:val="17"/>
                     </w:rPr>
                     <w:t>0.696</w:t>
                   </w:r>
@@ -1010,1252 +673,20 @@
           <w:p/>
           <w:p>
             <w:pPr>
-              <w:spacing w:after="40"/>
+              <w:spacing w:after="0" w:line="80" w:lineRule="exact"/>
             </w:pPr>
           </w:p>
           <w:p>
             <w:pPr>
-              <w:spacing w:after="40"/>
+              <w:spacing w:after="20" w:before="0" w:line="252" w:lineRule="auto"/>
             </w:pPr>
             <w:r>
               <w:rPr>
                 <w:rFonts w:ascii="맑은 고딕" w:hAnsi="맑은 고딕" w:eastAsia="맑은 고딕"/>
                 <w:b w:val="0"/>
-                <w:sz w:val="20"/>
+                <w:sz w:val="18"/>
               </w:rPr>
-              <w:t>[OCR: 학습 데이터 단어 62,464 + 라인 13,148, line exact % / CER]</w:t>
-            </w:r>
-          </w:p>
-          <w:tbl>
-            <w:tblPr>
-              <w:tblStyle w:val="TableGrid"/>
-              <w:tblW w:type="auto" w:w="0"/>
-              <w:tblLook w:firstColumn="1" w:firstRow="1" w:lastColumn="0" w:lastRow="0" w:noHBand="0" w:noVBand="1" w:val="04A0"/>
-            </w:tblPr>
-            <w:tblGrid>
-              <w:gridCol w:w="1500"/>
-              <w:gridCol w:w="1500"/>
-              <w:gridCol w:w="1500"/>
-              <w:gridCol w:w="1500"/>
-              <w:gridCol w:w="1500"/>
-              <w:gridCol w:w="1500"/>
-            </w:tblGrid>
-            <w:tr>
-              <w:tc>
-                <w:tcPr>
-                  <w:tcW w:type="dxa" w:w="1500"/>
-                  <w:shd w:val="clear" w:color="auto" w:fill="F3F4F6"/>
-                </w:tcPr>
-                <w:p>
-                  <w:pPr>
-                    <w:spacing w:after="40"/>
-                    <w:jc w:val="center"/>
-                  </w:pPr>
-                  <w:r>
-                    <w:rPr>
-                      <w:rFonts w:ascii="맑은 고딕" w:hAnsi="맑은 고딕" w:eastAsia="맑은 고딕"/>
-                      <w:b/>
-                      <w:sz w:val="18"/>
-                    </w:rPr>
-                    <w:t>인식기</w:t>
-                  </w:r>
-                </w:p>
-              </w:tc>
-              <w:tc>
-                <w:tcPr>
-                  <w:tcW w:type="dxa" w:w="1500"/>
-                  <w:shd w:val="clear" w:color="auto" w:fill="F3F4F6"/>
-                </w:tcPr>
-                <w:p>
-                  <w:pPr>
-                    <w:spacing w:after="40"/>
-                    <w:jc w:val="center"/>
-                  </w:pPr>
-                  <w:r>
-                    <w:rPr>
-                      <w:rFonts w:ascii="맑은 고딕" w:hAnsi="맑은 고딕" w:eastAsia="맑은 고딕"/>
-                      <w:b/>
-                      <w:sz w:val="18"/>
-                    </w:rPr>
-                    <w:t>강남</w:t>
-                  </w:r>
-                </w:p>
-              </w:tc>
-              <w:tc>
-                <w:tcPr>
-                  <w:tcW w:type="dxa" w:w="1500"/>
-                  <w:shd w:val="clear" w:color="auto" w:fill="F3F4F6"/>
-                </w:tcPr>
-                <w:p>
-                  <w:pPr>
-                    <w:spacing w:after="40"/>
-                    <w:jc w:val="center"/>
-                  </w:pPr>
-                  <w:r>
-                    <w:rPr>
-                      <w:rFonts w:ascii="맑은 고딕" w:hAnsi="맑은 고딕" w:eastAsia="맑은 고딕"/>
-                      <w:b/>
-                      <w:sz w:val="18"/>
-                    </w:rPr>
-                    <w:t>브루클린</w:t>
-                  </w:r>
-                </w:p>
-              </w:tc>
-              <w:tc>
-                <w:tcPr>
-                  <w:tcW w:type="dxa" w:w="1500"/>
-                  <w:shd w:val="clear" w:color="auto" w:fill="F3F4F6"/>
-                </w:tcPr>
-                <w:p>
-                  <w:pPr>
-                    <w:spacing w:after="40"/>
-                    <w:jc w:val="center"/>
-                  </w:pPr>
-                  <w:r>
-                    <w:rPr>
-                      <w:rFonts w:ascii="맑은 고딕" w:hAnsi="맑은 고딕" w:eastAsia="맑은 고딕"/>
-                      <w:b/>
-                      <w:sz w:val="18"/>
-                    </w:rPr>
-                    <w:t>수원</w:t>
-                  </w:r>
-                </w:p>
-              </w:tc>
-              <w:tc>
-                <w:tcPr>
-                  <w:tcW w:type="dxa" w:w="1500"/>
-                  <w:shd w:val="clear" w:color="auto" w:fill="F3F4F6"/>
-                </w:tcPr>
-                <w:p>
-                  <w:pPr>
-                    <w:spacing w:after="40"/>
-                    <w:jc w:val="center"/>
-                  </w:pPr>
-                  <w:r>
-                    <w:rPr>
-                      <w:rFonts w:ascii="맑은 고딕" w:hAnsi="맑은 고딕" w:eastAsia="맑은 고딕"/>
-                      <w:b/>
-                      <w:sz w:val="18"/>
-                    </w:rPr>
-                    <w:t>전체</w:t>
-                  </w:r>
-                </w:p>
-              </w:tc>
-              <w:tc>
-                <w:tcPr>
-                  <w:tcW w:type="dxa" w:w="1500"/>
-                  <w:shd w:val="clear" w:color="auto" w:fill="F3F4F6"/>
-                </w:tcPr>
-                <w:p>
-                  <w:pPr>
-                    <w:spacing w:after="40"/>
-                    <w:jc w:val="center"/>
-                  </w:pPr>
-                  <w:r>
-                    <w:rPr>
-                      <w:rFonts w:ascii="맑은 고딕" w:hAnsi="맑은 고딕" w:eastAsia="맑은 고딕"/>
-                      <w:b/>
-                      <w:sz w:val="18"/>
-                    </w:rPr>
-                    <w:t>CER</w:t>
-                  </w:r>
-                </w:p>
-              </w:tc>
-            </w:tr>
-            <w:tr>
-              <w:tc>
-                <w:tcPr>
-                  <w:tcW w:type="dxa" w:w="1500"/>
-                </w:tcPr>
-                <w:p>
-                  <w:pPr>
-                    <w:spacing w:after="40"/>
-                  </w:pPr>
-                  <w:r>
-                    <w:rPr>
-                      <w:rFonts w:ascii="맑은 고딕" w:hAnsi="맑은 고딕" w:eastAsia="맑은 고딕"/>
-                      <w:b/>
-                      <w:sz w:val="18"/>
-                    </w:rPr>
-                    <w:t>SVTRv2-B</w:t>
-                  </w:r>
-                </w:p>
-              </w:tc>
-              <w:tc>
-                <w:tcPr>
-                  <w:tcW w:type="dxa" w:w="1500"/>
-                </w:tcPr>
-                <w:p>
-                  <w:pPr>
-                    <w:spacing w:after="40"/>
-                    <w:jc w:val="center"/>
-                  </w:pPr>
-                  <w:r>
-                    <w:rPr>
-                      <w:rFonts w:ascii="맑은 고딕" w:hAnsi="맑은 고딕" w:eastAsia="맑은 고딕"/>
-                      <w:b/>
-                      <w:sz w:val="18"/>
-                    </w:rPr>
-                    <w:t>74.5 / 0.185</w:t>
-                  </w:r>
-                </w:p>
-              </w:tc>
-              <w:tc>
-                <w:tcPr>
-                  <w:tcW w:type="dxa" w:w="1500"/>
-                </w:tcPr>
-                <w:p>
-                  <w:pPr>
-                    <w:spacing w:after="40"/>
-                    <w:jc w:val="center"/>
-                  </w:pPr>
-                  <w:r>
-                    <w:rPr>
-                      <w:rFonts w:ascii="맑은 고딕" w:hAnsi="맑은 고딕" w:eastAsia="맑은 고딕"/>
-                      <w:b/>
-                      <w:sz w:val="18"/>
-                    </w:rPr>
-                    <w:t>78.9 / 0.105</w:t>
-                  </w:r>
-                </w:p>
-              </w:tc>
-              <w:tc>
-                <w:tcPr>
-                  <w:tcW w:type="dxa" w:w="1500"/>
-                </w:tcPr>
-                <w:p>
-                  <w:pPr>
-                    <w:spacing w:after="40"/>
-                    <w:jc w:val="center"/>
-                  </w:pPr>
-                  <w:r>
-                    <w:rPr>
-                      <w:rFonts w:ascii="맑은 고딕" w:hAnsi="맑은 고딕" w:eastAsia="맑은 고딕"/>
-                      <w:b/>
-                      <w:sz w:val="18"/>
-                    </w:rPr>
-                    <w:t>72.9 / 0.197</w:t>
-                  </w:r>
-                </w:p>
-              </w:tc>
-              <w:tc>
-                <w:tcPr>
-                  <w:tcW w:type="dxa" w:w="1500"/>
-                </w:tcPr>
-                <w:p>
-                  <w:pPr>
-                    <w:spacing w:after="40"/>
-                    <w:jc w:val="center"/>
-                  </w:pPr>
-                  <w:r>
-                    <w:rPr>
-                      <w:rFonts w:ascii="맑은 고딕" w:hAnsi="맑은 고딕" w:eastAsia="맑은 고딕"/>
-                      <w:b/>
-                      <w:sz w:val="18"/>
-                    </w:rPr>
-                    <w:t>75.5</w:t>
-                  </w:r>
-                </w:p>
-              </w:tc>
-              <w:tc>
-                <w:tcPr>
-                  <w:tcW w:type="dxa" w:w="1500"/>
-                </w:tcPr>
-                <w:p>
-                  <w:pPr>
-                    <w:spacing w:after="40"/>
-                    <w:jc w:val="center"/>
-                  </w:pPr>
-                  <w:r>
-                    <w:rPr>
-                      <w:rFonts w:ascii="맑은 고딕" w:hAnsi="맑은 고딕" w:eastAsia="맑은 고딕"/>
-                      <w:b/>
-                      <w:sz w:val="18"/>
-                    </w:rPr>
-                    <w:t>0.147</w:t>
-                  </w:r>
-                </w:p>
-              </w:tc>
-            </w:tr>
-            <w:tr>
-              <w:tc>
-                <w:tcPr>
-                  <w:tcW w:type="dxa" w:w="1500"/>
-                </w:tcPr>
-                <w:p>
-                  <w:pPr>
-                    <w:spacing w:after="40"/>
-                  </w:pPr>
-                  <w:r>
-                    <w:rPr>
-                      <w:rFonts w:ascii="맑은 고딕" w:hAnsi="맑은 고딕" w:eastAsia="맑은 고딕"/>
-                      <w:b w:val="0"/>
-                      <w:sz w:val="18"/>
-                    </w:rPr>
-                    <w:t>PaddleOCR PP-OCRv5</w:t>
-                  </w:r>
-                </w:p>
-              </w:tc>
-              <w:tc>
-                <w:tcPr>
-                  <w:tcW w:type="dxa" w:w="1500"/>
-                </w:tcPr>
-                <w:p>
-                  <w:pPr>
-                    <w:spacing w:after="40"/>
-                    <w:jc w:val="center"/>
-                  </w:pPr>
-                  <w:r>
-                    <w:rPr>
-                      <w:rFonts w:ascii="맑은 고딕" w:hAnsi="맑은 고딕" w:eastAsia="맑은 고딕"/>
-                      <w:b w:val="0"/>
-                      <w:sz w:val="18"/>
-                    </w:rPr>
-                    <w:t>73.6 / 0.190</w:t>
-                  </w:r>
-                </w:p>
-              </w:tc>
-              <w:tc>
-                <w:tcPr>
-                  <w:tcW w:type="dxa" w:w="1500"/>
-                </w:tcPr>
-                <w:p>
-                  <w:pPr>
-                    <w:spacing w:after="40"/>
-                    <w:jc w:val="center"/>
-                  </w:pPr>
-                  <w:r>
-                    <w:rPr>
-                      <w:rFonts w:ascii="맑은 고딕" w:hAnsi="맑은 고딕" w:eastAsia="맑은 고딕"/>
-                      <w:b w:val="0"/>
-                      <w:sz w:val="18"/>
-                    </w:rPr>
-                    <w:t>77.9 / 0.108</w:t>
-                  </w:r>
-                </w:p>
-              </w:tc>
-              <w:tc>
-                <w:tcPr>
-                  <w:tcW w:type="dxa" w:w="1500"/>
-                </w:tcPr>
-                <w:p>
-                  <w:pPr>
-                    <w:spacing w:after="40"/>
-                    <w:jc w:val="center"/>
-                  </w:pPr>
-                  <w:r>
-                    <w:rPr>
-                      <w:rFonts w:ascii="맑은 고딕" w:hAnsi="맑은 고딕" w:eastAsia="맑은 고딕"/>
-                      <w:b w:val="0"/>
-                      <w:sz w:val="18"/>
-                    </w:rPr>
-                    <w:t>68.5 / 0.190</w:t>
-                  </w:r>
-                </w:p>
-              </w:tc>
-              <w:tc>
-                <w:tcPr>
-                  <w:tcW w:type="dxa" w:w="1500"/>
-                </w:tcPr>
-                <w:p>
-                  <w:pPr>
-                    <w:spacing w:after="40"/>
-                    <w:jc w:val="center"/>
-                  </w:pPr>
-                  <w:r>
-                    <w:rPr>
-                      <w:rFonts w:ascii="맑은 고딕" w:hAnsi="맑은 고딕" w:eastAsia="맑은 고딕"/>
-                      <w:b w:val="0"/>
-                      <w:sz w:val="18"/>
-                    </w:rPr>
-                    <w:t>73.5</w:t>
-                  </w:r>
-                </w:p>
-              </w:tc>
-              <w:tc>
-                <w:tcPr>
-                  <w:tcW w:type="dxa" w:w="1500"/>
-                </w:tcPr>
-                <w:p>
-                  <w:pPr>
-                    <w:spacing w:after="40"/>
-                    <w:jc w:val="center"/>
-                  </w:pPr>
-                  <w:r>
-                    <w:rPr>
-                      <w:rFonts w:ascii="맑은 고딕" w:hAnsi="맑은 고딕" w:eastAsia="맑은 고딕"/>
-                      <w:b w:val="0"/>
-                      <w:sz w:val="18"/>
-                    </w:rPr>
-                    <w:t>0.149</w:t>
-                  </w:r>
-                </w:p>
-              </w:tc>
-            </w:tr>
-            <w:tr>
-              <w:tc>
-                <w:tcPr>
-                  <w:tcW w:type="dxa" w:w="1500"/>
-                </w:tcPr>
-                <w:p>
-                  <w:pPr>
-                    <w:spacing w:after="40"/>
-                  </w:pPr>
-                  <w:r>
-                    <w:rPr>
-                      <w:rFonts w:ascii="맑은 고딕" w:hAnsi="맑은 고딕" w:eastAsia="맑은 고딕"/>
-                      <w:b w:val="0"/>
-                      <w:sz w:val="18"/>
-                    </w:rPr>
-                    <w:t>PARSeq (ViT-S)</w:t>
-                  </w:r>
-                </w:p>
-              </w:tc>
-              <w:tc>
-                <w:tcPr>
-                  <w:tcW w:type="dxa" w:w="1500"/>
-                </w:tcPr>
-                <w:p>
-                  <w:pPr>
-                    <w:spacing w:after="40"/>
-                    <w:jc w:val="center"/>
-                  </w:pPr>
-                  <w:r>
-                    <w:rPr>
-                      <w:rFonts w:ascii="맑은 고딕" w:hAnsi="맑은 고딕" w:eastAsia="맑은 고딕"/>
-                      <w:b w:val="0"/>
-                      <w:sz w:val="18"/>
-                    </w:rPr>
-                    <w:t>70.8 / 0.242</w:t>
-                  </w:r>
-                </w:p>
-              </w:tc>
-              <w:tc>
-                <w:tcPr>
-                  <w:tcW w:type="dxa" w:w="1500"/>
-                </w:tcPr>
-                <w:p>
-                  <w:pPr>
-                    <w:spacing w:after="40"/>
-                    <w:jc w:val="center"/>
-                  </w:pPr>
-                  <w:r>
-                    <w:rPr>
-                      <w:rFonts w:ascii="맑은 고딕" w:hAnsi="맑은 고딕" w:eastAsia="맑은 고딕"/>
-                      <w:b w:val="0"/>
-                      <w:sz w:val="18"/>
-                    </w:rPr>
-                    <w:t>71.9 / 0.133</w:t>
-                  </w:r>
-                </w:p>
-              </w:tc>
-              <w:tc>
-                <w:tcPr>
-                  <w:tcW w:type="dxa" w:w="1500"/>
-                </w:tcPr>
-                <w:p>
-                  <w:pPr>
-                    <w:spacing w:after="40"/>
-                    <w:jc w:val="center"/>
-                  </w:pPr>
-                  <w:r>
-                    <w:rPr>
-                      <w:rFonts w:ascii="맑은 고딕" w:hAnsi="맑은 고딕" w:eastAsia="맑은 고딕"/>
-                      <w:b w:val="0"/>
-                      <w:sz w:val="18"/>
-                    </w:rPr>
-                    <w:t>62.4 / 0.290</w:t>
-                  </w:r>
-                </w:p>
-              </w:tc>
-              <w:tc>
-                <w:tcPr>
-                  <w:tcW w:type="dxa" w:w="1500"/>
-                </w:tcPr>
-                <w:p>
-                  <w:pPr>
-                    <w:spacing w:after="40"/>
-                    <w:jc w:val="center"/>
-                  </w:pPr>
-                  <w:r>
-                    <w:rPr>
-                      <w:rFonts w:ascii="맑은 고딕" w:hAnsi="맑은 고딕" w:eastAsia="맑은 고딕"/>
-                      <w:b w:val="0"/>
-                      <w:sz w:val="18"/>
-                    </w:rPr>
-                    <w:t>68.6</w:t>
-                  </w:r>
-                </w:p>
-              </w:tc>
-              <w:tc>
-                <w:tcPr>
-                  <w:tcW w:type="dxa" w:w="1500"/>
-                </w:tcPr>
-                <w:p>
-                  <w:pPr>
-                    <w:spacing w:after="40"/>
-                    <w:jc w:val="center"/>
-                  </w:pPr>
-                  <w:r>
-                    <w:rPr>
-                      <w:rFonts w:ascii="맑은 고딕" w:hAnsi="맑은 고딕" w:eastAsia="맑은 고딕"/>
-                      <w:b w:val="0"/>
-                      <w:sz w:val="18"/>
-                    </w:rPr>
-                    <w:t>0.197</w:t>
-                  </w:r>
-                </w:p>
-              </w:tc>
-            </w:tr>
-          </w:tbl>
-          <w:p/>
-          <w:p>
-            <w:pPr>
-              <w:spacing w:after="40"/>
-            </w:pPr>
-          </w:p>
-          <w:p>
-            <w:pPr>
-              <w:spacing w:after="40"/>
-            </w:pPr>
-            <w:r>
-              <w:rPr>
-                <w:rFonts w:ascii="맑은 고딕" w:hAnsi="맑은 고딕" w:eastAsia="맑은 고딕"/>
-                <w:b w:val="0"/>
-                <w:sz w:val="20"/>
-              </w:rPr>
-              <w:t>[VLM 교정: SVTRv2-B 출력 교정, fixtext = OCR 텍스트만 / fix = 간판 이미지 + OCR 텍스트]</w:t>
-            </w:r>
-          </w:p>
-          <w:tbl>
-            <w:tblPr>
-              <w:tblStyle w:val="TableGrid"/>
-              <w:tblW w:type="auto" w:w="0"/>
-              <w:tblLook w:firstColumn="1" w:firstRow="1" w:lastColumn="0" w:lastRow="0" w:noHBand="0" w:noVBand="1" w:val="04A0"/>
-            </w:tblPr>
-            <w:tblGrid>
-              <w:gridCol w:w="1500"/>
-              <w:gridCol w:w="1500"/>
-              <w:gridCol w:w="1500"/>
-              <w:gridCol w:w="1500"/>
-              <w:gridCol w:w="1500"/>
-              <w:gridCol w:w="1500"/>
-            </w:tblGrid>
-            <w:tr>
-              <w:tc>
-                <w:tcPr>
-                  <w:tcW w:type="dxa" w:w="1500"/>
-                  <w:shd w:val="clear" w:color="auto" w:fill="F3F4F6"/>
-                </w:tcPr>
-                <w:p>
-                  <w:pPr>
-                    <w:spacing w:after="40"/>
-                    <w:jc w:val="center"/>
-                  </w:pPr>
-                  <w:r>
-                    <w:rPr>
-                      <w:rFonts w:ascii="맑은 고딕" w:hAnsi="맑은 고딕" w:eastAsia="맑은 고딕"/>
-                      <w:b/>
-                      <w:sz w:val="18"/>
-                    </w:rPr>
-                    <w:t>방법</w:t>
-                  </w:r>
-                </w:p>
-              </w:tc>
-              <w:tc>
-                <w:tcPr>
-                  <w:tcW w:type="dxa" w:w="1500"/>
-                  <w:shd w:val="clear" w:color="auto" w:fill="F3F4F6"/>
-                </w:tcPr>
-                <w:p>
-                  <w:pPr>
-                    <w:spacing w:after="40"/>
-                    <w:jc w:val="center"/>
-                  </w:pPr>
-                  <w:r>
-                    <w:rPr>
-                      <w:rFonts w:ascii="맑은 고딕" w:hAnsi="맑은 고딕" w:eastAsia="맑은 고딕"/>
-                      <w:b/>
-                      <w:sz w:val="18"/>
-                    </w:rPr>
-                    <w:t>강남</w:t>
-                  </w:r>
-                </w:p>
-              </w:tc>
-              <w:tc>
-                <w:tcPr>
-                  <w:tcW w:type="dxa" w:w="1500"/>
-                  <w:shd w:val="clear" w:color="auto" w:fill="F3F4F6"/>
-                </w:tcPr>
-                <w:p>
-                  <w:pPr>
-                    <w:spacing w:after="40"/>
-                    <w:jc w:val="center"/>
-                  </w:pPr>
-                  <w:r>
-                    <w:rPr>
-                      <w:rFonts w:ascii="맑은 고딕" w:hAnsi="맑은 고딕" w:eastAsia="맑은 고딕"/>
-                      <w:b/>
-                      <w:sz w:val="18"/>
-                    </w:rPr>
-                    <w:t>브루클린</w:t>
-                  </w:r>
-                </w:p>
-              </w:tc>
-              <w:tc>
-                <w:tcPr>
-                  <w:tcW w:type="dxa" w:w="1500"/>
-                  <w:shd w:val="clear" w:color="auto" w:fill="F3F4F6"/>
-                </w:tcPr>
-                <w:p>
-                  <w:pPr>
-                    <w:spacing w:after="40"/>
-                    <w:jc w:val="center"/>
-                  </w:pPr>
-                  <w:r>
-                    <w:rPr>
-                      <w:rFonts w:ascii="맑은 고딕" w:hAnsi="맑은 고딕" w:eastAsia="맑은 고딕"/>
-                      <w:b/>
-                      <w:sz w:val="18"/>
-                    </w:rPr>
-                    <w:t>수원</w:t>
-                  </w:r>
-                </w:p>
-              </w:tc>
-              <w:tc>
-                <w:tcPr>
-                  <w:tcW w:type="dxa" w:w="1500"/>
-                  <w:shd w:val="clear" w:color="auto" w:fill="F3F4F6"/>
-                </w:tcPr>
-                <w:p>
-                  <w:pPr>
-                    <w:spacing w:after="40"/>
-                    <w:jc w:val="center"/>
-                  </w:pPr>
-                  <w:r>
-                    <w:rPr>
-                      <w:rFonts w:ascii="맑은 고딕" w:hAnsi="맑은 고딕" w:eastAsia="맑은 고딕"/>
-                      <w:b/>
-                      <w:sz w:val="18"/>
-                    </w:rPr>
-                    <w:t>전체</w:t>
-                  </w:r>
-                </w:p>
-              </w:tc>
-              <w:tc>
-                <w:tcPr>
-                  <w:tcW w:type="dxa" w:w="1500"/>
-                  <w:shd w:val="clear" w:color="auto" w:fill="F3F4F6"/>
-                </w:tcPr>
-                <w:p>
-                  <w:pPr>
-                    <w:spacing w:after="40"/>
-                    <w:jc w:val="center"/>
-                  </w:pPr>
-                  <w:r>
-                    <w:rPr>
-                      <w:rFonts w:ascii="맑은 고딕" w:hAnsi="맑은 고딕" w:eastAsia="맑은 고딕"/>
-                      <w:b/>
-                      <w:sz w:val="18"/>
-                    </w:rPr>
-                    <w:t>CER</w:t>
-                  </w:r>
-                </w:p>
-              </w:tc>
-            </w:tr>
-            <w:tr>
-              <w:tc>
-                <w:tcPr>
-                  <w:tcW w:type="dxa" w:w="1500"/>
-                </w:tcPr>
-                <w:p>
-                  <w:pPr>
-                    <w:spacing w:after="40"/>
-                  </w:pPr>
-                  <w:r>
-                    <w:rPr>
-                      <w:rFonts w:ascii="맑은 고딕" w:hAnsi="맑은 고딕" w:eastAsia="맑은 고딕"/>
-                      <w:b w:val="0"/>
-                      <w:sz w:val="18"/>
-                    </w:rPr>
-                    <w:t>교정 없음 (SVTRv2-B)</w:t>
-                  </w:r>
-                </w:p>
-              </w:tc>
-              <w:tc>
-                <w:tcPr>
-                  <w:tcW w:type="dxa" w:w="1500"/>
-                </w:tcPr>
-                <w:p>
-                  <w:pPr>
-                    <w:spacing w:after="40"/>
-                    <w:jc w:val="center"/>
-                  </w:pPr>
-                  <w:r>
-                    <w:rPr>
-                      <w:rFonts w:ascii="맑은 고딕" w:hAnsi="맑은 고딕" w:eastAsia="맑은 고딕"/>
-                      <w:b w:val="0"/>
-                      <w:sz w:val="18"/>
-                    </w:rPr>
-                    <w:t>74.5</w:t>
-                  </w:r>
-                </w:p>
-              </w:tc>
-              <w:tc>
-                <w:tcPr>
-                  <w:tcW w:type="dxa" w:w="1500"/>
-                </w:tcPr>
-                <w:p>
-                  <w:pPr>
-                    <w:spacing w:after="40"/>
-                    <w:jc w:val="center"/>
-                  </w:pPr>
-                  <w:r>
-                    <w:rPr>
-                      <w:rFonts w:ascii="맑은 고딕" w:hAnsi="맑은 고딕" w:eastAsia="맑은 고딕"/>
-                      <w:b w:val="0"/>
-                      <w:sz w:val="18"/>
-                    </w:rPr>
-                    <w:t>78.9</w:t>
-                  </w:r>
-                </w:p>
-              </w:tc>
-              <w:tc>
-                <w:tcPr>
-                  <w:tcW w:type="dxa" w:w="1500"/>
-                </w:tcPr>
-                <w:p>
-                  <w:pPr>
-                    <w:spacing w:after="40"/>
-                    <w:jc w:val="center"/>
-                  </w:pPr>
-                  <w:r>
-                    <w:rPr>
-                      <w:rFonts w:ascii="맑은 고딕" w:hAnsi="맑은 고딕" w:eastAsia="맑은 고딕"/>
-                      <w:b w:val="0"/>
-                      <w:sz w:val="18"/>
-                    </w:rPr>
-                    <w:t>72.9</w:t>
-                  </w:r>
-                </w:p>
-              </w:tc>
-              <w:tc>
-                <w:tcPr>
-                  <w:tcW w:type="dxa" w:w="1500"/>
-                </w:tcPr>
-                <w:p>
-                  <w:pPr>
-                    <w:spacing w:after="40"/>
-                    <w:jc w:val="center"/>
-                  </w:pPr>
-                  <w:r>
-                    <w:rPr>
-                      <w:rFonts w:ascii="맑은 고딕" w:hAnsi="맑은 고딕" w:eastAsia="맑은 고딕"/>
-                      <w:b w:val="0"/>
-                      <w:sz w:val="18"/>
-                    </w:rPr>
-                    <w:t>75.5</w:t>
-                  </w:r>
-                </w:p>
-              </w:tc>
-              <w:tc>
-                <w:tcPr>
-                  <w:tcW w:type="dxa" w:w="1500"/>
-                </w:tcPr>
-                <w:p>
-                  <w:pPr>
-                    <w:spacing w:after="40"/>
-                    <w:jc w:val="center"/>
-                  </w:pPr>
-                  <w:r>
-                    <w:rPr>
-                      <w:rFonts w:ascii="맑은 고딕" w:hAnsi="맑은 고딕" w:eastAsia="맑은 고딕"/>
-                      <w:b w:val="0"/>
-                      <w:sz w:val="18"/>
-                    </w:rPr>
-                    <w:t>0.147</w:t>
-                  </w:r>
-                </w:p>
-              </w:tc>
-            </w:tr>
-            <w:tr>
-              <w:tc>
-                <w:tcPr>
-                  <w:tcW w:type="dxa" w:w="1500"/>
-                </w:tcPr>
-                <w:p>
-                  <w:pPr>
-                    <w:spacing w:after="40"/>
-                  </w:pPr>
-                  <w:r>
-                    <w:rPr>
-                      <w:rFonts w:ascii="맑은 고딕" w:hAnsi="맑은 고딕" w:eastAsia="맑은 고딕"/>
-                      <w:b w:val="0"/>
-                      <w:sz w:val="18"/>
-                    </w:rPr>
-                    <w:t>fixtext · Gemma 4 31B</w:t>
-                  </w:r>
-                </w:p>
-              </w:tc>
-              <w:tc>
-                <w:tcPr>
-                  <w:tcW w:type="dxa" w:w="1500"/>
-                </w:tcPr>
-                <w:p>
-                  <w:pPr>
-                    <w:spacing w:after="40"/>
-                    <w:jc w:val="center"/>
-                  </w:pPr>
-                  <w:r>
-                    <w:rPr>
-                      <w:rFonts w:ascii="맑은 고딕" w:hAnsi="맑은 고딕" w:eastAsia="맑은 고딕"/>
-                      <w:b w:val="0"/>
-                      <w:sz w:val="18"/>
-                    </w:rPr>
-                    <w:t>76.9</w:t>
-                  </w:r>
-                </w:p>
-              </w:tc>
-              <w:tc>
-                <w:tcPr>
-                  <w:tcW w:type="dxa" w:w="1500"/>
-                </w:tcPr>
-                <w:p>
-                  <w:pPr>
-                    <w:spacing w:after="40"/>
-                    <w:jc w:val="center"/>
-                  </w:pPr>
-                  <w:r>
-                    <w:rPr>
-                      <w:rFonts w:ascii="맑은 고딕" w:hAnsi="맑은 고딕" w:eastAsia="맑은 고딕"/>
-                      <w:b w:val="0"/>
-                      <w:sz w:val="18"/>
-                    </w:rPr>
-                    <w:t>78.9</w:t>
-                  </w:r>
-                </w:p>
-              </w:tc>
-              <w:tc>
-                <w:tcPr>
-                  <w:tcW w:type="dxa" w:w="1500"/>
-                </w:tcPr>
-                <w:p>
-                  <w:pPr>
-                    <w:spacing w:after="40"/>
-                    <w:jc w:val="center"/>
-                  </w:pPr>
-                  <w:r>
-                    <w:rPr>
-                      <w:rFonts w:ascii="맑은 고딕" w:hAnsi="맑은 고딕" w:eastAsia="맑은 고딕"/>
-                      <w:b w:val="0"/>
-                      <w:sz w:val="18"/>
-                    </w:rPr>
-                    <w:t>73.5</w:t>
-                  </w:r>
-                </w:p>
-              </w:tc>
-              <w:tc>
-                <w:tcPr>
-                  <w:tcW w:type="dxa" w:w="1500"/>
-                </w:tcPr>
-                <w:p>
-                  <w:pPr>
-                    <w:spacing w:after="40"/>
-                    <w:jc w:val="center"/>
-                  </w:pPr>
-                  <w:r>
-                    <w:rPr>
-                      <w:rFonts w:ascii="맑은 고딕" w:hAnsi="맑은 고딕" w:eastAsia="맑은 고딕"/>
-                      <w:b w:val="0"/>
-                      <w:sz w:val="18"/>
-                    </w:rPr>
-                    <w:t>76.5</w:t>
-                  </w:r>
-                </w:p>
-              </w:tc>
-              <w:tc>
-                <w:tcPr>
-                  <w:tcW w:type="dxa" w:w="1500"/>
-                </w:tcPr>
-                <w:p>
-                  <w:pPr>
-                    <w:spacing w:after="40"/>
-                    <w:jc w:val="center"/>
-                  </w:pPr>
-                  <w:r>
-                    <w:rPr>
-                      <w:rFonts w:ascii="맑은 고딕" w:hAnsi="맑은 고딕" w:eastAsia="맑은 고딕"/>
-                      <w:b w:val="0"/>
-                      <w:sz w:val="18"/>
-                    </w:rPr>
-                    <w:t>0.149</w:t>
-                  </w:r>
-                </w:p>
-              </w:tc>
-            </w:tr>
-            <w:tr>
-              <w:tc>
-                <w:tcPr>
-                  <w:tcW w:type="dxa" w:w="1500"/>
-                </w:tcPr>
-                <w:p>
-                  <w:pPr>
-                    <w:spacing w:after="40"/>
-                  </w:pPr>
-                  <w:r>
-                    <w:rPr>
-                      <w:rFonts w:ascii="맑은 고딕" w:hAnsi="맑은 고딕" w:eastAsia="맑은 고딕"/>
-                      <w:b/>
-                      <w:sz w:val="18"/>
-                    </w:rPr>
-                    <w:t>fix · Gemma 4 31B</w:t>
-                  </w:r>
-                </w:p>
-              </w:tc>
-              <w:tc>
-                <w:tcPr>
-                  <w:tcW w:type="dxa" w:w="1500"/>
-                </w:tcPr>
-                <w:p>
-                  <w:pPr>
-                    <w:spacing w:after="40"/>
-                    <w:jc w:val="center"/>
-                  </w:pPr>
-                  <w:r>
-                    <w:rPr>
-                      <w:rFonts w:ascii="맑은 고딕" w:hAnsi="맑은 고딕" w:eastAsia="맑은 고딕"/>
-                      <w:b/>
-                      <w:sz w:val="18"/>
-                    </w:rPr>
-                    <w:t>82.5</w:t>
-                  </w:r>
-                </w:p>
-              </w:tc>
-              <w:tc>
-                <w:tcPr>
-                  <w:tcW w:type="dxa" w:w="1500"/>
-                </w:tcPr>
-                <w:p>
-                  <w:pPr>
-                    <w:spacing w:after="40"/>
-                    <w:jc w:val="center"/>
-                  </w:pPr>
-                  <w:r>
-                    <w:rPr>
-                      <w:rFonts w:ascii="맑은 고딕" w:hAnsi="맑은 고딕" w:eastAsia="맑은 고딕"/>
-                      <w:b/>
-                      <w:sz w:val="18"/>
-                    </w:rPr>
-                    <w:t>88.4</w:t>
-                  </w:r>
-                </w:p>
-              </w:tc>
-              <w:tc>
-                <w:tcPr>
-                  <w:tcW w:type="dxa" w:w="1500"/>
-                </w:tcPr>
-                <w:p>
-                  <w:pPr>
-                    <w:spacing w:after="40"/>
-                    <w:jc w:val="center"/>
-                  </w:pPr>
-                  <w:r>
-                    <w:rPr>
-                      <w:rFonts w:ascii="맑은 고딕" w:hAnsi="맑은 고딕" w:eastAsia="맑은 고딕"/>
-                      <w:b/>
-                      <w:sz w:val="18"/>
-                    </w:rPr>
-                    <w:t>79.0</w:t>
-                  </w:r>
-                </w:p>
-              </w:tc>
-              <w:tc>
-                <w:tcPr>
-                  <w:tcW w:type="dxa" w:w="1500"/>
-                </w:tcPr>
-                <w:p>
-                  <w:pPr>
-                    <w:spacing w:after="40"/>
-                    <w:jc w:val="center"/>
-                  </w:pPr>
-                  <w:r>
-                    <w:rPr>
-                      <w:rFonts w:ascii="맑은 고딕" w:hAnsi="맑은 고딕" w:eastAsia="맑은 고딕"/>
-                      <w:b/>
-                      <w:sz w:val="18"/>
-                    </w:rPr>
-                    <w:t>83.4</w:t>
-                  </w:r>
-                </w:p>
-              </w:tc>
-              <w:tc>
-                <w:tcPr>
-                  <w:tcW w:type="dxa" w:w="1500"/>
-                </w:tcPr>
-                <w:p>
-                  <w:pPr>
-                    <w:spacing w:after="40"/>
-                    <w:jc w:val="center"/>
-                  </w:pPr>
-                  <w:r>
-                    <w:rPr>
-                      <w:rFonts w:ascii="맑은 고딕" w:hAnsi="맑은 고딕" w:eastAsia="맑은 고딕"/>
-                      <w:b/>
-                      <w:sz w:val="18"/>
-                    </w:rPr>
-                    <w:t>0.128</w:t>
-                  </w:r>
-                </w:p>
-              </w:tc>
-            </w:tr>
-            <w:tr>
-              <w:tc>
-                <w:tcPr>
-                  <w:tcW w:type="dxa" w:w="1500"/>
-                </w:tcPr>
-                <w:p>
-                  <w:pPr>
-                    <w:spacing w:after="40"/>
-                  </w:pPr>
-                  <w:r>
-                    <w:rPr>
-                      <w:rFonts w:ascii="맑은 고딕" w:hAnsi="맑은 고딕" w:eastAsia="맑은 고딕"/>
-                      <w:b w:val="0"/>
-                      <w:sz w:val="18"/>
-                    </w:rPr>
-                    <w:t>fixtext · Qwen3-VL 32B</w:t>
-                  </w:r>
-                </w:p>
-              </w:tc>
-              <w:tc>
-                <w:tcPr>
-                  <w:tcW w:type="dxa" w:w="1500"/>
-                </w:tcPr>
-                <w:p>
-                  <w:pPr>
-                    <w:spacing w:after="40"/>
-                    <w:jc w:val="center"/>
-                  </w:pPr>
-                  <w:r>
-                    <w:rPr>
-                      <w:rFonts w:ascii="맑은 고딕" w:hAnsi="맑은 고딕" w:eastAsia="맑은 고딕"/>
-                      <w:b w:val="0"/>
-                      <w:sz w:val="18"/>
-                    </w:rPr>
-                    <w:t>74.5</w:t>
-                  </w:r>
-                </w:p>
-              </w:tc>
-              <w:tc>
-                <w:tcPr>
-                  <w:tcW w:type="dxa" w:w="1500"/>
-                </w:tcPr>
-                <w:p>
-                  <w:pPr>
-                    <w:spacing w:after="40"/>
-                    <w:jc w:val="center"/>
-                  </w:pPr>
-                  <w:r>
-                    <w:rPr>
-                      <w:rFonts w:ascii="맑은 고딕" w:hAnsi="맑은 고딕" w:eastAsia="맑은 고딕"/>
-                      <w:b w:val="0"/>
-                      <w:sz w:val="18"/>
-                    </w:rPr>
-                    <w:t>82.4</w:t>
-                  </w:r>
-                </w:p>
-              </w:tc>
-              <w:tc>
-                <w:tcPr>
-                  <w:tcW w:type="dxa" w:w="1500"/>
-                </w:tcPr>
-                <w:p>
-                  <w:pPr>
-                    <w:spacing w:after="40"/>
-                    <w:jc w:val="center"/>
-                  </w:pPr>
-                  <w:r>
-                    <w:rPr>
-                      <w:rFonts w:ascii="맑은 고딕" w:hAnsi="맑은 고딕" w:eastAsia="맑은 고딕"/>
-                      <w:b w:val="0"/>
-                      <w:sz w:val="18"/>
-                    </w:rPr>
-                    <w:t>72.4</w:t>
-                  </w:r>
-                </w:p>
-              </w:tc>
-              <w:tc>
-                <w:tcPr>
-                  <w:tcW w:type="dxa" w:w="1500"/>
-                </w:tcPr>
-                <w:p>
-                  <w:pPr>
-                    <w:spacing w:after="40"/>
-                    <w:jc w:val="center"/>
-                  </w:pPr>
-                  <w:r>
-                    <w:rPr>
-                      <w:rFonts w:ascii="맑은 고딕" w:hAnsi="맑은 고딕" w:eastAsia="맑은 고딕"/>
-                      <w:b w:val="0"/>
-                      <w:sz w:val="18"/>
-                    </w:rPr>
-                    <w:t>76.5</w:t>
-                  </w:r>
-                </w:p>
-              </w:tc>
-              <w:tc>
-                <w:tcPr>
-                  <w:tcW w:type="dxa" w:w="1500"/>
-                </w:tcPr>
-                <w:p>
-                  <w:pPr>
-                    <w:spacing w:after="40"/>
-                    <w:jc w:val="center"/>
-                  </w:pPr>
-                  <w:r>
-                    <w:rPr>
-                      <w:rFonts w:ascii="맑은 고딕" w:hAnsi="맑은 고딕" w:eastAsia="맑은 고딕"/>
-                      <w:b w:val="0"/>
-                      <w:sz w:val="18"/>
-                    </w:rPr>
-                    <w:t>0.144</w:t>
-                  </w:r>
-                </w:p>
-              </w:tc>
-            </w:tr>
-            <w:tr>
-              <w:tc>
-                <w:tcPr>
-                  <w:tcW w:type="dxa" w:w="1500"/>
-                </w:tcPr>
-                <w:p>
-                  <w:pPr>
-                    <w:spacing w:after="40"/>
-                  </w:pPr>
-                  <w:r>
-                    <w:rPr>
-                      <w:rFonts w:ascii="맑은 고딕" w:hAnsi="맑은 고딕" w:eastAsia="맑은 고딕"/>
-                      <w:b w:val="0"/>
-                      <w:sz w:val="18"/>
-                    </w:rPr>
-                    <w:t>fix · Qwen3-VL 32B</w:t>
-                  </w:r>
-                </w:p>
-              </w:tc>
-              <w:tc>
-                <w:tcPr>
-                  <w:tcW w:type="dxa" w:w="1500"/>
-                </w:tcPr>
-                <w:p>
-                  <w:pPr>
-                    <w:spacing w:after="40"/>
-                    <w:jc w:val="center"/>
-                  </w:pPr>
-                  <w:r>
-                    <w:rPr>
-                      <w:rFonts w:ascii="맑은 고딕" w:hAnsi="맑은 고딕" w:eastAsia="맑은 고딕"/>
-                      <w:b w:val="0"/>
-                      <w:sz w:val="18"/>
-                    </w:rPr>
-                    <w:t>80.7</w:t>
-                  </w:r>
-                </w:p>
-              </w:tc>
-              <w:tc>
-                <w:tcPr>
-                  <w:tcW w:type="dxa" w:w="1500"/>
-                </w:tcPr>
-                <w:p>
-                  <w:pPr>
-                    <w:spacing w:after="40"/>
-                    <w:jc w:val="center"/>
-                  </w:pPr>
-                  <w:r>
-                    <w:rPr>
-                      <w:rFonts w:ascii="맑은 고딕" w:hAnsi="맑은 고딕" w:eastAsia="맑은 고딕"/>
-                      <w:b w:val="0"/>
-                      <w:sz w:val="18"/>
-                    </w:rPr>
-                    <w:t>87.9</w:t>
-                  </w:r>
-                </w:p>
-              </w:tc>
-              <w:tc>
-                <w:tcPr>
-                  <w:tcW w:type="dxa" w:w="1500"/>
-                </w:tcPr>
-                <w:p>
-                  <w:pPr>
-                    <w:spacing w:after="40"/>
-                    <w:jc w:val="center"/>
-                  </w:pPr>
-                  <w:r>
-                    <w:rPr>
-                      <w:rFonts w:ascii="맑은 고딕" w:hAnsi="맑은 고딕" w:eastAsia="맑은 고딕"/>
-                      <w:b w:val="0"/>
-                      <w:sz w:val="18"/>
-                    </w:rPr>
-                    <w:t>79.6</w:t>
-                  </w:r>
-                </w:p>
-              </w:tc>
-              <w:tc>
-                <w:tcPr>
-                  <w:tcW w:type="dxa" w:w="1500"/>
-                </w:tcPr>
-                <w:p>
-                  <w:pPr>
-                    <w:spacing w:after="40"/>
-                    <w:jc w:val="center"/>
-                  </w:pPr>
-                  <w:r>
-                    <w:rPr>
-                      <w:rFonts w:ascii="맑은 고딕" w:hAnsi="맑은 고딕" w:eastAsia="맑은 고딕"/>
-                      <w:b w:val="0"/>
-                      <w:sz w:val="18"/>
-                    </w:rPr>
-                    <w:t>82.8</w:t>
-                  </w:r>
-                </w:p>
-              </w:tc>
-              <w:tc>
-                <w:tcPr>
-                  <w:tcW w:type="dxa" w:w="1500"/>
-                </w:tcPr>
-                <w:p>
-                  <w:pPr>
-                    <w:spacing w:after="40"/>
-                    <w:jc w:val="center"/>
-                  </w:pPr>
-                  <w:r>
-                    <w:rPr>
-                      <w:rFonts w:ascii="맑은 고딕" w:hAnsi="맑은 고딕" w:eastAsia="맑은 고딕"/>
-                      <w:b w:val="0"/>
-                      <w:sz w:val="18"/>
-                    </w:rPr>
-                    <w:t>0.133</w:t>
-                  </w:r>
-                </w:p>
-              </w:tc>
-            </w:tr>
-          </w:tbl>
-          <w:p/>
-          <w:p>
-            <w:pPr>
-              <w:spacing w:after="40"/>
-            </w:pPr>
-          </w:p>
-          <w:p>
-            <w:pPr>
-              <w:spacing w:after="40"/>
-            </w:pPr>
-            <w:r>
-              <w:rPr>
-                <w:rFonts w:ascii="맑은 고딕" w:hAnsi="맑은 고딕" w:eastAsia="맑은 고딕"/>
-                <w:b w:val="0"/>
-                <w:sz w:val="20"/>
-              </w:rPr>
-              <w:t>[전체 파이프라인: 간판 검출 TP 374 / FN 79 / FP 96, OCR = line exact % / CER]</w:t>
+              <w:t>[OCR 3종 (단어 62,464 + 라인 13,148로 미세조정) · VLM 2종 교정(SVTRv2-B 출력) — fixtext: 텍스트만, fix: 이미지 + 텍스트]</w:t>
             </w:r>
           </w:p>
           <w:tbl>
@@ -2274,19 +705,828 @@
             <w:tr>
               <w:tc>
                 <w:tcPr>
-                  <w:tcW w:type="dxa" w:w="1800"/>
+                  <w:tcW w:type="dxa" w:w="1440"/>
                   <w:shd w:val="clear" w:color="auto" w:fill="F3F4F6"/>
                 </w:tcPr>
                 <w:p>
                   <w:pPr>
-                    <w:spacing w:after="40"/>
+                    <w:spacing w:after="20" w:before="0" w:line="252" w:lineRule="auto"/>
                     <w:jc w:val="center"/>
                   </w:pPr>
                   <w:r>
                     <w:rPr>
                       <w:rFonts w:ascii="맑은 고딕" w:hAnsi="맑은 고딕" w:eastAsia="맑은 고딕"/>
                       <w:b/>
-                      <w:sz w:val="18"/>
+                      <w:sz w:val="17"/>
+                    </w:rPr>
+                    <w:t>단계</w:t>
+                  </w:r>
+                </w:p>
+              </w:tc>
+              <w:tc>
+                <w:tcPr>
+                  <w:tcW w:type="dxa" w:w="2592"/>
+                  <w:shd w:val="clear" w:color="auto" w:fill="F3F4F6"/>
+                </w:tcPr>
+                <w:p>
+                  <w:pPr>
+                    <w:spacing w:after="20" w:before="0" w:line="252" w:lineRule="auto"/>
+                    <w:jc w:val="center"/>
+                  </w:pPr>
+                  <w:r>
+                    <w:rPr>
+                      <w:rFonts w:ascii="맑은 고딕" w:hAnsi="맑은 고딕" w:eastAsia="맑은 고딕"/>
+                      <w:b/>
+                      <w:sz w:val="17"/>
+                    </w:rPr>
+                    <w:t>모델</w:t>
+                  </w:r>
+                </w:p>
+              </w:tc>
+              <w:tc>
+                <w:tcPr>
+                  <w:tcW w:type="dxa" w:w="1296"/>
+                  <w:shd w:val="clear" w:color="auto" w:fill="F3F4F6"/>
+                </w:tcPr>
+                <w:p>
+                  <w:pPr>
+                    <w:spacing w:after="20" w:before="0" w:line="252" w:lineRule="auto"/>
+                    <w:jc w:val="center"/>
+                  </w:pPr>
+                  <w:r>
+                    <w:rPr>
+                      <w:rFonts w:ascii="맑은 고딕" w:hAnsi="맑은 고딕" w:eastAsia="맑은 고딕"/>
+                      <w:b/>
+                      <w:sz w:val="17"/>
+                    </w:rPr>
+                    <w:t>방법</w:t>
+                  </w:r>
+                </w:p>
+              </w:tc>
+              <w:tc>
+                <w:tcPr>
+                  <w:tcW w:type="dxa" w:w="1728"/>
+                  <w:shd w:val="clear" w:color="auto" w:fill="F3F4F6"/>
+                </w:tcPr>
+                <w:p>
+                  <w:pPr>
+                    <w:spacing w:after="20" w:before="0" w:line="252" w:lineRule="auto"/>
+                    <w:jc w:val="center"/>
+                  </w:pPr>
+                  <w:r>
+                    <w:rPr>
+                      <w:rFonts w:ascii="맑은 고딕" w:hAnsi="맑은 고딕" w:eastAsia="맑은 고딕"/>
+                      <w:b/>
+                      <w:sz w:val="17"/>
+                    </w:rPr>
+                    <w:t>line exact (%)</w:t>
+                  </w:r>
+                </w:p>
+              </w:tc>
+              <w:tc>
+                <w:tcPr>
+                  <w:tcW w:type="dxa" w:w="1440"/>
+                  <w:shd w:val="clear" w:color="auto" w:fill="F3F4F6"/>
+                </w:tcPr>
+                <w:p>
+                  <w:pPr>
+                    <w:spacing w:after="20" w:before="0" w:line="252" w:lineRule="auto"/>
+                    <w:jc w:val="center"/>
+                  </w:pPr>
+                  <w:r>
+                    <w:rPr>
+                      <w:rFonts w:ascii="맑은 고딕" w:hAnsi="맑은 고딕" w:eastAsia="맑은 고딕"/>
+                      <w:b/>
+                      <w:sz w:val="17"/>
+                    </w:rPr>
+                    <w:t>CER</w:t>
+                  </w:r>
+                </w:p>
+              </w:tc>
+            </w:tr>
+            <w:tr>
+              <w:tc>
+                <w:tcPr>
+                  <w:tcW w:type="dxa" w:w="1440"/>
+                </w:tcPr>
+                <w:p>
+                  <w:pPr>
+                    <w:spacing w:after="20" w:before="0" w:line="252" w:lineRule="auto"/>
+                  </w:pPr>
+                  <w:r>
+                    <w:rPr>
+                      <w:rFonts w:ascii="맑은 고딕" w:hAnsi="맑은 고딕" w:eastAsia="맑은 고딕"/>
+                      <w:b/>
+                      <w:sz w:val="17"/>
+                    </w:rPr>
+                    <w:t>OCR</w:t>
+                  </w:r>
+                </w:p>
+              </w:tc>
+              <w:tc>
+                <w:tcPr>
+                  <w:tcW w:type="dxa" w:w="2592"/>
+                </w:tcPr>
+                <w:p>
+                  <w:pPr>
+                    <w:spacing w:after="20" w:before="0" w:line="252" w:lineRule="auto"/>
+                    <w:jc w:val="center"/>
+                  </w:pPr>
+                  <w:r>
+                    <w:rPr>
+                      <w:rFonts w:ascii="맑은 고딕" w:hAnsi="맑은 고딕" w:eastAsia="맑은 고딕"/>
+                      <w:b/>
+                      <w:sz w:val="17"/>
+                    </w:rPr>
+                    <w:t>SVTRv2-B</w:t>
+                  </w:r>
+                </w:p>
+              </w:tc>
+              <w:tc>
+                <w:tcPr>
+                  <w:tcW w:type="dxa" w:w="1296"/>
+                </w:tcPr>
+                <w:p>
+                  <w:pPr>
+                    <w:spacing w:after="20" w:before="0" w:line="252" w:lineRule="auto"/>
+                    <w:jc w:val="center"/>
+                  </w:pPr>
+                  <w:r>
+                    <w:rPr>
+                      <w:rFonts w:ascii="맑은 고딕" w:hAnsi="맑은 고딕" w:eastAsia="맑은 고딕"/>
+                      <w:b/>
+                      <w:sz w:val="17"/>
+                    </w:rPr>
+                    <w:t>—</w:t>
+                  </w:r>
+                </w:p>
+              </w:tc>
+              <w:tc>
+                <w:tcPr>
+                  <w:tcW w:type="dxa" w:w="1728"/>
+                </w:tcPr>
+                <w:p>
+                  <w:pPr>
+                    <w:spacing w:after="20" w:before="0" w:line="252" w:lineRule="auto"/>
+                    <w:jc w:val="center"/>
+                  </w:pPr>
+                  <w:r>
+                    <w:rPr>
+                      <w:rFonts w:ascii="맑은 고딕" w:hAnsi="맑은 고딕" w:eastAsia="맑은 고딕"/>
+                      <w:b/>
+                      <w:sz w:val="17"/>
+                    </w:rPr>
+                    <w:t>75.5</w:t>
+                  </w:r>
+                </w:p>
+              </w:tc>
+              <w:tc>
+                <w:tcPr>
+                  <w:tcW w:type="dxa" w:w="1440"/>
+                </w:tcPr>
+                <w:p>
+                  <w:pPr>
+                    <w:spacing w:after="20" w:before="0" w:line="252" w:lineRule="auto"/>
+                    <w:jc w:val="center"/>
+                  </w:pPr>
+                  <w:r>
+                    <w:rPr>
+                      <w:rFonts w:ascii="맑은 고딕" w:hAnsi="맑은 고딕" w:eastAsia="맑은 고딕"/>
+                      <w:b/>
+                      <w:sz w:val="17"/>
+                    </w:rPr>
+                    <w:t>0.147</w:t>
+                  </w:r>
+                </w:p>
+              </w:tc>
+            </w:tr>
+            <w:tr>
+              <w:tc>
+                <w:tcPr>
+                  <w:tcW w:type="dxa" w:w="1440"/>
+                </w:tcPr>
+                <w:p>
+                  <w:pPr>
+                    <w:spacing w:after="20" w:before="0" w:line="252" w:lineRule="auto"/>
+                  </w:pPr>
+                  <w:r>
+                    <w:rPr>
+                      <w:rFonts w:ascii="맑은 고딕" w:hAnsi="맑은 고딕" w:eastAsia="맑은 고딕"/>
+                      <w:b w:val="0"/>
+                      <w:sz w:val="17"/>
+                    </w:rPr>
+                    <w:t>OCR</w:t>
+                  </w:r>
+                </w:p>
+              </w:tc>
+              <w:tc>
+                <w:tcPr>
+                  <w:tcW w:type="dxa" w:w="2592"/>
+                </w:tcPr>
+                <w:p>
+                  <w:pPr>
+                    <w:spacing w:after="20" w:before="0" w:line="252" w:lineRule="auto"/>
+                    <w:jc w:val="center"/>
+                  </w:pPr>
+                  <w:r>
+                    <w:rPr>
+                      <w:rFonts w:ascii="맑은 고딕" w:hAnsi="맑은 고딕" w:eastAsia="맑은 고딕"/>
+                      <w:b w:val="0"/>
+                      <w:sz w:val="17"/>
+                    </w:rPr>
+                    <w:t>PaddleOCR PP-OCRv5</w:t>
+                  </w:r>
+                </w:p>
+              </w:tc>
+              <w:tc>
+                <w:tcPr>
+                  <w:tcW w:type="dxa" w:w="1296"/>
+                </w:tcPr>
+                <w:p>
+                  <w:pPr>
+                    <w:spacing w:after="20" w:before="0" w:line="252" w:lineRule="auto"/>
+                    <w:jc w:val="center"/>
+                  </w:pPr>
+                  <w:r>
+                    <w:rPr>
+                      <w:rFonts w:ascii="맑은 고딕" w:hAnsi="맑은 고딕" w:eastAsia="맑은 고딕"/>
+                      <w:b w:val="0"/>
+                      <w:sz w:val="17"/>
+                    </w:rPr>
+                    <w:t>—</w:t>
+                  </w:r>
+                </w:p>
+              </w:tc>
+              <w:tc>
+                <w:tcPr>
+                  <w:tcW w:type="dxa" w:w="1728"/>
+                </w:tcPr>
+                <w:p>
+                  <w:pPr>
+                    <w:spacing w:after="20" w:before="0" w:line="252" w:lineRule="auto"/>
+                    <w:jc w:val="center"/>
+                  </w:pPr>
+                  <w:r>
+                    <w:rPr>
+                      <w:rFonts w:ascii="맑은 고딕" w:hAnsi="맑은 고딕" w:eastAsia="맑은 고딕"/>
+                      <w:b w:val="0"/>
+                      <w:sz w:val="17"/>
+                    </w:rPr>
+                    <w:t>73.5</w:t>
+                  </w:r>
+                </w:p>
+              </w:tc>
+              <w:tc>
+                <w:tcPr>
+                  <w:tcW w:type="dxa" w:w="1440"/>
+                </w:tcPr>
+                <w:p>
+                  <w:pPr>
+                    <w:spacing w:after="20" w:before="0" w:line="252" w:lineRule="auto"/>
+                    <w:jc w:val="center"/>
+                  </w:pPr>
+                  <w:r>
+                    <w:rPr>
+                      <w:rFonts w:ascii="맑은 고딕" w:hAnsi="맑은 고딕" w:eastAsia="맑은 고딕"/>
+                      <w:b w:val="0"/>
+                      <w:sz w:val="17"/>
+                    </w:rPr>
+                    <w:t>0.149</w:t>
+                  </w:r>
+                </w:p>
+              </w:tc>
+            </w:tr>
+            <w:tr>
+              <w:tc>
+                <w:tcPr>
+                  <w:tcW w:type="dxa" w:w="1440"/>
+                </w:tcPr>
+                <w:p>
+                  <w:pPr>
+                    <w:spacing w:after="20" w:before="0" w:line="252" w:lineRule="auto"/>
+                  </w:pPr>
+                  <w:r>
+                    <w:rPr>
+                      <w:rFonts w:ascii="맑은 고딕" w:hAnsi="맑은 고딕" w:eastAsia="맑은 고딕"/>
+                      <w:b w:val="0"/>
+                      <w:sz w:val="17"/>
+                    </w:rPr>
+                    <w:t>OCR</w:t>
+                  </w:r>
+                </w:p>
+              </w:tc>
+              <w:tc>
+                <w:tcPr>
+                  <w:tcW w:type="dxa" w:w="2592"/>
+                </w:tcPr>
+                <w:p>
+                  <w:pPr>
+                    <w:spacing w:after="20" w:before="0" w:line="252" w:lineRule="auto"/>
+                    <w:jc w:val="center"/>
+                  </w:pPr>
+                  <w:r>
+                    <w:rPr>
+                      <w:rFonts w:ascii="맑은 고딕" w:hAnsi="맑은 고딕" w:eastAsia="맑은 고딕"/>
+                      <w:b w:val="0"/>
+                      <w:sz w:val="17"/>
+                    </w:rPr>
+                    <w:t>PARSeq (ViT-S)</w:t>
+                  </w:r>
+                </w:p>
+              </w:tc>
+              <w:tc>
+                <w:tcPr>
+                  <w:tcW w:type="dxa" w:w="1296"/>
+                </w:tcPr>
+                <w:p>
+                  <w:pPr>
+                    <w:spacing w:after="20" w:before="0" w:line="252" w:lineRule="auto"/>
+                    <w:jc w:val="center"/>
+                  </w:pPr>
+                  <w:r>
+                    <w:rPr>
+                      <w:rFonts w:ascii="맑은 고딕" w:hAnsi="맑은 고딕" w:eastAsia="맑은 고딕"/>
+                      <w:b w:val="0"/>
+                      <w:sz w:val="17"/>
+                    </w:rPr>
+                    <w:t>—</w:t>
+                  </w:r>
+                </w:p>
+              </w:tc>
+              <w:tc>
+                <w:tcPr>
+                  <w:tcW w:type="dxa" w:w="1728"/>
+                </w:tcPr>
+                <w:p>
+                  <w:pPr>
+                    <w:spacing w:after="20" w:before="0" w:line="252" w:lineRule="auto"/>
+                    <w:jc w:val="center"/>
+                  </w:pPr>
+                  <w:r>
+                    <w:rPr>
+                      <w:rFonts w:ascii="맑은 고딕" w:hAnsi="맑은 고딕" w:eastAsia="맑은 고딕"/>
+                      <w:b w:val="0"/>
+                      <w:sz w:val="17"/>
+                    </w:rPr>
+                    <w:t>68.6</w:t>
+                  </w:r>
+                </w:p>
+              </w:tc>
+              <w:tc>
+                <w:tcPr>
+                  <w:tcW w:type="dxa" w:w="1440"/>
+                </w:tcPr>
+                <w:p>
+                  <w:pPr>
+                    <w:spacing w:after="20" w:before="0" w:line="252" w:lineRule="auto"/>
+                    <w:jc w:val="center"/>
+                  </w:pPr>
+                  <w:r>
+                    <w:rPr>
+                      <w:rFonts w:ascii="맑은 고딕" w:hAnsi="맑은 고딕" w:eastAsia="맑은 고딕"/>
+                      <w:b w:val="0"/>
+                      <w:sz w:val="17"/>
+                    </w:rPr>
+                    <w:t>0.197</w:t>
+                  </w:r>
+                </w:p>
+              </w:tc>
+            </w:tr>
+            <w:tr>
+              <w:tc>
+                <w:tcPr>
+                  <w:tcW w:type="dxa" w:w="1440"/>
+                </w:tcPr>
+                <w:p>
+                  <w:pPr>
+                    <w:spacing w:after="20" w:before="0" w:line="252" w:lineRule="auto"/>
+                  </w:pPr>
+                  <w:r>
+                    <w:rPr>
+                      <w:rFonts w:ascii="맑은 고딕" w:hAnsi="맑은 고딕" w:eastAsia="맑은 고딕"/>
+                      <w:b w:val="0"/>
+                      <w:sz w:val="17"/>
+                    </w:rPr>
+                    <w:t>VLM 교정</w:t>
+                  </w:r>
+                </w:p>
+              </w:tc>
+              <w:tc>
+                <w:tcPr>
+                  <w:tcW w:type="dxa" w:w="2592"/>
+                </w:tcPr>
+                <w:p>
+                  <w:pPr>
+                    <w:spacing w:after="20" w:before="0" w:line="252" w:lineRule="auto"/>
+                    <w:jc w:val="center"/>
+                  </w:pPr>
+                  <w:r>
+                    <w:rPr>
+                      <w:rFonts w:ascii="맑은 고딕" w:hAnsi="맑은 고딕" w:eastAsia="맑은 고딕"/>
+                      <w:b w:val="0"/>
+                      <w:sz w:val="17"/>
+                    </w:rPr>
+                    <w:t>Gemma 4 31B</w:t>
+                  </w:r>
+                </w:p>
+              </w:tc>
+              <w:tc>
+                <w:tcPr>
+                  <w:tcW w:type="dxa" w:w="1296"/>
+                </w:tcPr>
+                <w:p>
+                  <w:pPr>
+                    <w:spacing w:after="20" w:before="0" w:line="252" w:lineRule="auto"/>
+                    <w:jc w:val="center"/>
+                  </w:pPr>
+                  <w:r>
+                    <w:rPr>
+                      <w:rFonts w:ascii="맑은 고딕" w:hAnsi="맑은 고딕" w:eastAsia="맑은 고딕"/>
+                      <w:b w:val="0"/>
+                      <w:sz w:val="17"/>
+                    </w:rPr>
+                    <w:t>fixtext</w:t>
+                  </w:r>
+                </w:p>
+              </w:tc>
+              <w:tc>
+                <w:tcPr>
+                  <w:tcW w:type="dxa" w:w="1728"/>
+                </w:tcPr>
+                <w:p>
+                  <w:pPr>
+                    <w:spacing w:after="20" w:before="0" w:line="252" w:lineRule="auto"/>
+                    <w:jc w:val="center"/>
+                  </w:pPr>
+                  <w:r>
+                    <w:rPr>
+                      <w:rFonts w:ascii="맑은 고딕" w:hAnsi="맑은 고딕" w:eastAsia="맑은 고딕"/>
+                      <w:b w:val="0"/>
+                      <w:sz w:val="17"/>
+                    </w:rPr>
+                    <w:t>76.5</w:t>
+                  </w:r>
+                </w:p>
+              </w:tc>
+              <w:tc>
+                <w:tcPr>
+                  <w:tcW w:type="dxa" w:w="1440"/>
+                </w:tcPr>
+                <w:p>
+                  <w:pPr>
+                    <w:spacing w:after="20" w:before="0" w:line="252" w:lineRule="auto"/>
+                    <w:jc w:val="center"/>
+                  </w:pPr>
+                  <w:r>
+                    <w:rPr>
+                      <w:rFonts w:ascii="맑은 고딕" w:hAnsi="맑은 고딕" w:eastAsia="맑은 고딕"/>
+                      <w:b w:val="0"/>
+                      <w:sz w:val="17"/>
+                    </w:rPr>
+                    <w:t>0.149</w:t>
+                  </w:r>
+                </w:p>
+              </w:tc>
+            </w:tr>
+            <w:tr>
+              <w:tc>
+                <w:tcPr>
+                  <w:tcW w:type="dxa" w:w="1440"/>
+                </w:tcPr>
+                <w:p>
+                  <w:pPr>
+                    <w:spacing w:after="20" w:before="0" w:line="252" w:lineRule="auto"/>
+                  </w:pPr>
+                  <w:r>
+                    <w:rPr>
+                      <w:rFonts w:ascii="맑은 고딕" w:hAnsi="맑은 고딕" w:eastAsia="맑은 고딕"/>
+                      <w:b/>
+                      <w:sz w:val="17"/>
+                    </w:rPr>
+                    <w:t>VLM 교정</w:t>
+                  </w:r>
+                </w:p>
+              </w:tc>
+              <w:tc>
+                <w:tcPr>
+                  <w:tcW w:type="dxa" w:w="2592"/>
+                </w:tcPr>
+                <w:p>
+                  <w:pPr>
+                    <w:spacing w:after="20" w:before="0" w:line="252" w:lineRule="auto"/>
+                    <w:jc w:val="center"/>
+                  </w:pPr>
+                  <w:r>
+                    <w:rPr>
+                      <w:rFonts w:ascii="맑은 고딕" w:hAnsi="맑은 고딕" w:eastAsia="맑은 고딕"/>
+                      <w:b/>
+                      <w:sz w:val="17"/>
+                    </w:rPr>
+                    <w:t>Gemma 4 31B</w:t>
+                  </w:r>
+                </w:p>
+              </w:tc>
+              <w:tc>
+                <w:tcPr>
+                  <w:tcW w:type="dxa" w:w="1296"/>
+                </w:tcPr>
+                <w:p>
+                  <w:pPr>
+                    <w:spacing w:after="20" w:before="0" w:line="252" w:lineRule="auto"/>
+                    <w:jc w:val="center"/>
+                  </w:pPr>
+                  <w:r>
+                    <w:rPr>
+                      <w:rFonts w:ascii="맑은 고딕" w:hAnsi="맑은 고딕" w:eastAsia="맑은 고딕"/>
+                      <w:b/>
+                      <w:sz w:val="17"/>
+                    </w:rPr>
+                    <w:t>fix</w:t>
+                  </w:r>
+                </w:p>
+              </w:tc>
+              <w:tc>
+                <w:tcPr>
+                  <w:tcW w:type="dxa" w:w="1728"/>
+                </w:tcPr>
+                <w:p>
+                  <w:pPr>
+                    <w:spacing w:after="20" w:before="0" w:line="252" w:lineRule="auto"/>
+                    <w:jc w:val="center"/>
+                  </w:pPr>
+                  <w:r>
+                    <w:rPr>
+                      <w:rFonts w:ascii="맑은 고딕" w:hAnsi="맑은 고딕" w:eastAsia="맑은 고딕"/>
+                      <w:b/>
+                      <w:sz w:val="17"/>
+                    </w:rPr>
+                    <w:t>83.4</w:t>
+                  </w:r>
+                </w:p>
+              </w:tc>
+              <w:tc>
+                <w:tcPr>
+                  <w:tcW w:type="dxa" w:w="1440"/>
+                </w:tcPr>
+                <w:p>
+                  <w:pPr>
+                    <w:spacing w:after="20" w:before="0" w:line="252" w:lineRule="auto"/>
+                    <w:jc w:val="center"/>
+                  </w:pPr>
+                  <w:r>
+                    <w:rPr>
+                      <w:rFonts w:ascii="맑은 고딕" w:hAnsi="맑은 고딕" w:eastAsia="맑은 고딕"/>
+                      <w:b/>
+                      <w:sz w:val="17"/>
+                    </w:rPr>
+                    <w:t>0.128</w:t>
+                  </w:r>
+                </w:p>
+              </w:tc>
+            </w:tr>
+            <w:tr>
+              <w:tc>
+                <w:tcPr>
+                  <w:tcW w:type="dxa" w:w="1440"/>
+                </w:tcPr>
+                <w:p>
+                  <w:pPr>
+                    <w:spacing w:after="20" w:before="0" w:line="252" w:lineRule="auto"/>
+                  </w:pPr>
+                  <w:r>
+                    <w:rPr>
+                      <w:rFonts w:ascii="맑은 고딕" w:hAnsi="맑은 고딕" w:eastAsia="맑은 고딕"/>
+                      <w:b w:val="0"/>
+                      <w:sz w:val="17"/>
+                    </w:rPr>
+                    <w:t>VLM 교정</w:t>
+                  </w:r>
+                </w:p>
+              </w:tc>
+              <w:tc>
+                <w:tcPr>
+                  <w:tcW w:type="dxa" w:w="2592"/>
+                </w:tcPr>
+                <w:p>
+                  <w:pPr>
+                    <w:spacing w:after="20" w:before="0" w:line="252" w:lineRule="auto"/>
+                    <w:jc w:val="center"/>
+                  </w:pPr>
+                  <w:r>
+                    <w:rPr>
+                      <w:rFonts w:ascii="맑은 고딕" w:hAnsi="맑은 고딕" w:eastAsia="맑은 고딕"/>
+                      <w:b w:val="0"/>
+                      <w:sz w:val="17"/>
+                    </w:rPr>
+                    <w:t>Qwen3-VL 32B</w:t>
+                  </w:r>
+                </w:p>
+              </w:tc>
+              <w:tc>
+                <w:tcPr>
+                  <w:tcW w:type="dxa" w:w="1296"/>
+                </w:tcPr>
+                <w:p>
+                  <w:pPr>
+                    <w:spacing w:after="20" w:before="0" w:line="252" w:lineRule="auto"/>
+                    <w:jc w:val="center"/>
+                  </w:pPr>
+                  <w:r>
+                    <w:rPr>
+                      <w:rFonts w:ascii="맑은 고딕" w:hAnsi="맑은 고딕" w:eastAsia="맑은 고딕"/>
+                      <w:b w:val="0"/>
+                      <w:sz w:val="17"/>
+                    </w:rPr>
+                    <w:t>fixtext</w:t>
+                  </w:r>
+                </w:p>
+              </w:tc>
+              <w:tc>
+                <w:tcPr>
+                  <w:tcW w:type="dxa" w:w="1728"/>
+                </w:tcPr>
+                <w:p>
+                  <w:pPr>
+                    <w:spacing w:after="20" w:before="0" w:line="252" w:lineRule="auto"/>
+                    <w:jc w:val="center"/>
+                  </w:pPr>
+                  <w:r>
+                    <w:rPr>
+                      <w:rFonts w:ascii="맑은 고딕" w:hAnsi="맑은 고딕" w:eastAsia="맑은 고딕"/>
+                      <w:b w:val="0"/>
+                      <w:sz w:val="17"/>
+                    </w:rPr>
+                    <w:t>76.5</w:t>
+                  </w:r>
+                </w:p>
+              </w:tc>
+              <w:tc>
+                <w:tcPr>
+                  <w:tcW w:type="dxa" w:w="1440"/>
+                </w:tcPr>
+                <w:p>
+                  <w:pPr>
+                    <w:spacing w:after="20" w:before="0" w:line="252" w:lineRule="auto"/>
+                    <w:jc w:val="center"/>
+                  </w:pPr>
+                  <w:r>
+                    <w:rPr>
+                      <w:rFonts w:ascii="맑은 고딕" w:hAnsi="맑은 고딕" w:eastAsia="맑은 고딕"/>
+                      <w:b w:val="0"/>
+                      <w:sz w:val="17"/>
+                    </w:rPr>
+                    <w:t>0.144</w:t>
+                  </w:r>
+                </w:p>
+              </w:tc>
+            </w:tr>
+            <w:tr>
+              <w:tc>
+                <w:tcPr>
+                  <w:tcW w:type="dxa" w:w="1440"/>
+                </w:tcPr>
+                <w:p>
+                  <w:pPr>
+                    <w:spacing w:after="20" w:before="0" w:line="252" w:lineRule="auto"/>
+                  </w:pPr>
+                  <w:r>
+                    <w:rPr>
+                      <w:rFonts w:ascii="맑은 고딕" w:hAnsi="맑은 고딕" w:eastAsia="맑은 고딕"/>
+                      <w:b w:val="0"/>
+                      <w:sz w:val="17"/>
+                    </w:rPr>
+                    <w:t>VLM 교정</w:t>
+                  </w:r>
+                </w:p>
+              </w:tc>
+              <w:tc>
+                <w:tcPr>
+                  <w:tcW w:type="dxa" w:w="2592"/>
+                </w:tcPr>
+                <w:p>
+                  <w:pPr>
+                    <w:spacing w:after="20" w:before="0" w:line="252" w:lineRule="auto"/>
+                    <w:jc w:val="center"/>
+                  </w:pPr>
+                  <w:r>
+                    <w:rPr>
+                      <w:rFonts w:ascii="맑은 고딕" w:hAnsi="맑은 고딕" w:eastAsia="맑은 고딕"/>
+                      <w:b w:val="0"/>
+                      <w:sz w:val="17"/>
+                    </w:rPr>
+                    <w:t>Qwen3-VL 32B</w:t>
+                  </w:r>
+                </w:p>
+              </w:tc>
+              <w:tc>
+                <w:tcPr>
+                  <w:tcW w:type="dxa" w:w="1296"/>
+                </w:tcPr>
+                <w:p>
+                  <w:pPr>
+                    <w:spacing w:after="20" w:before="0" w:line="252" w:lineRule="auto"/>
+                    <w:jc w:val="center"/>
+                  </w:pPr>
+                  <w:r>
+                    <w:rPr>
+                      <w:rFonts w:ascii="맑은 고딕" w:hAnsi="맑은 고딕" w:eastAsia="맑은 고딕"/>
+                      <w:b w:val="0"/>
+                      <w:sz w:val="17"/>
+                    </w:rPr>
+                    <w:t>fix</w:t>
+                  </w:r>
+                </w:p>
+              </w:tc>
+              <w:tc>
+                <w:tcPr>
+                  <w:tcW w:type="dxa" w:w="1728"/>
+                </w:tcPr>
+                <w:p>
+                  <w:pPr>
+                    <w:spacing w:after="20" w:before="0" w:line="252" w:lineRule="auto"/>
+                    <w:jc w:val="center"/>
+                  </w:pPr>
+                  <w:r>
+                    <w:rPr>
+                      <w:rFonts w:ascii="맑은 고딕" w:hAnsi="맑은 고딕" w:eastAsia="맑은 고딕"/>
+                      <w:b w:val="0"/>
+                      <w:sz w:val="17"/>
+                    </w:rPr>
+                    <w:t>82.8</w:t>
+                  </w:r>
+                </w:p>
+              </w:tc>
+              <w:tc>
+                <w:tcPr>
+                  <w:tcW w:type="dxa" w:w="1440"/>
+                </w:tcPr>
+                <w:p>
+                  <w:pPr>
+                    <w:spacing w:after="20" w:before="0" w:line="252" w:lineRule="auto"/>
+                    <w:jc w:val="center"/>
+                  </w:pPr>
+                  <w:r>
+                    <w:rPr>
+                      <w:rFonts w:ascii="맑은 고딕" w:hAnsi="맑은 고딕" w:eastAsia="맑은 고딕"/>
+                      <w:b w:val="0"/>
+                      <w:sz w:val="17"/>
+                    </w:rPr>
+                    <w:t>0.133</w:t>
+                  </w:r>
+                </w:p>
+              </w:tc>
+            </w:tr>
+          </w:tbl>
+          <w:p/>
+          <w:p>
+            <w:pPr>
+              <w:spacing w:after="0" w:line="80" w:lineRule="exact"/>
+            </w:pPr>
+          </w:p>
+          <w:p>
+            <w:pPr>
+              <w:spacing w:after="20" w:before="0" w:line="252" w:lineRule="auto"/>
+            </w:pPr>
+            <w:r>
+              <w:rPr>
+                <w:rFonts w:ascii="맑은 고딕" w:hAnsi="맑은 고딕" w:eastAsia="맑은 고딕"/>
+                <w:b w:val="0"/>
+                <w:sz w:val="18"/>
+              </w:rPr>
+              <w:t>[전체 파이프라인: 간판 검출 YOLO26x — TP 374 / FN 79 / FP 96, OCR = SVTRv2-B + Gemma 4 fix]</w:t>
+            </w:r>
+          </w:p>
+          <w:tbl>
+            <w:tblPr>
+              <w:tblStyle w:val="TableGrid"/>
+              <w:tblW w:type="auto" w:w="0"/>
+              <w:tblLook w:firstColumn="1" w:firstRow="1" w:lastColumn="0" w:lastRow="0" w:noHBand="0" w:noVBand="1" w:val="04A0"/>
+            </w:tblPr>
+            <w:tblGrid>
+              <w:gridCol w:w="1286"/>
+              <w:gridCol w:w="1286"/>
+              <w:gridCol w:w="1286"/>
+              <w:gridCol w:w="1286"/>
+              <w:gridCol w:w="1286"/>
+              <w:gridCol w:w="1286"/>
+              <w:gridCol w:w="1286"/>
+            </w:tblGrid>
+            <w:tr>
+              <w:tc>
+                <w:tcPr>
+                  <w:tcW w:type="dxa" w:w="1286"/>
+                  <w:shd w:val="clear" w:color="auto" w:fill="F3F4F6"/>
+                </w:tcPr>
+                <w:p>
+                  <w:pPr>
+                    <w:spacing w:after="20" w:before="0" w:line="252" w:lineRule="auto"/>
+                    <w:jc w:val="center"/>
+                  </w:pPr>
+                  <w:r>
+                    <w:rPr>
+                      <w:rFonts w:ascii="맑은 고딕" w:hAnsi="맑은 고딕" w:eastAsia="맑은 고딕"/>
+                      <w:b/>
+                      <w:sz w:val="17"/>
                     </w:rPr>
                     <w:t>파이프라인</w:t>
                   </w:r>
@@ -2294,81 +1534,131 @@
               </w:tc>
               <w:tc>
                 <w:tcPr>
-                  <w:tcW w:type="dxa" w:w="1800"/>
+                  <w:tcW w:type="dxa" w:w="1286"/>
                   <w:shd w:val="clear" w:color="auto" w:fill="F3F4F6"/>
                 </w:tcPr>
                 <w:p>
                   <w:pPr>
-                    <w:spacing w:after="40"/>
+                    <w:spacing w:after="20" w:before="0" w:line="252" w:lineRule="auto"/>
                     <w:jc w:val="center"/>
                   </w:pPr>
                   <w:r>
                     <w:rPr>
                       <w:rFonts w:ascii="맑은 고딕" w:hAnsi="맑은 고딕" w:eastAsia="맑은 고딕"/>
                       <w:b/>
-                      <w:sz w:val="18"/>
+                      <w:sz w:val="17"/>
                     </w:rPr>
-                    <w:t>OCR+VLM (검출된 간판)</w:t>
+                    <w:t>line exact (%)</w:t>
+                    <w:br/>
+                    <w:t>검출 간판</w:t>
                   </w:r>
                 </w:p>
               </w:tc>
               <w:tc>
                 <w:tcPr>
-                  <w:tcW w:type="dxa" w:w="1800"/>
+                  <w:tcW w:type="dxa" w:w="1286"/>
                   <w:shd w:val="clear" w:color="auto" w:fill="F3F4F6"/>
                 </w:tcPr>
                 <w:p>
                   <w:pPr>
-                    <w:spacing w:after="40"/>
+                    <w:spacing w:after="20" w:before="0" w:line="252" w:lineRule="auto"/>
                     <w:jc w:val="center"/>
                   </w:pPr>
                   <w:r>
                     <w:rPr>
                       <w:rFonts w:ascii="맑은 고딕" w:hAnsi="맑은 고딕" w:eastAsia="맑은 고딕"/>
                       <w:b/>
-                      <w:sz w:val="18"/>
+                      <w:sz w:val="17"/>
                     </w:rPr>
-                    <w:t>OCR+VLM (정답 간판)</w:t>
+                    <w:t>CER</w:t>
+                    <w:br/>
+                    <w:t>검출 간판</w:t>
                   </w:r>
                 </w:p>
               </w:tc>
               <w:tc>
                 <w:tcPr>
-                  <w:tcW w:type="dxa" w:w="1800"/>
+                  <w:tcW w:type="dxa" w:w="1286"/>
                   <w:shd w:val="clear" w:color="auto" w:fill="F3F4F6"/>
                 </w:tcPr>
                 <w:p>
                   <w:pPr>
-                    <w:spacing w:after="40"/>
+                    <w:spacing w:after="20" w:before="0" w:line="252" w:lineRule="auto"/>
                     <w:jc w:val="center"/>
                   </w:pPr>
                   <w:r>
                     <w:rPr>
                       <w:rFonts w:ascii="맑은 고딕" w:hAnsi="맑은 고딕" w:eastAsia="맑은 고딕"/>
                       <w:b/>
-                      <w:sz w:val="18"/>
+                      <w:sz w:val="17"/>
                     </w:rPr>
-                    <w:t>업종 태깅 정확도</w:t>
+                    <w:t>line exact (%)</w:t>
+                    <w:br/>
+                    <w:t>정답 간판</w:t>
                   </w:r>
                 </w:p>
               </w:tc>
               <w:tc>
                 <w:tcPr>
-                  <w:tcW w:type="dxa" w:w="1800"/>
+                  <w:tcW w:type="dxa" w:w="1286"/>
                   <w:shd w:val="clear" w:color="auto" w:fill="F3F4F6"/>
                 </w:tcPr>
                 <w:p>
                   <w:pPr>
-                    <w:spacing w:after="40"/>
+                    <w:spacing w:after="20" w:before="0" w:line="252" w:lineRule="auto"/>
                     <w:jc w:val="center"/>
                   </w:pPr>
                   <w:r>
                     <w:rPr>
                       <w:rFonts w:ascii="맑은 고딕" w:hAnsi="맑은 고딕" w:eastAsia="맑은 고딕"/>
                       <w:b/>
-                      <w:sz w:val="18"/>
+                      <w:sz w:val="17"/>
+                    </w:rPr>
+                    <w:t>CER</w:t>
+                    <w:br/>
+                    <w:t>정답 간판</w:t>
+                  </w:r>
+                </w:p>
+              </w:tc>
+              <w:tc>
+                <w:tcPr>
+                  <w:tcW w:type="dxa" w:w="1286"/>
+                  <w:shd w:val="clear" w:color="auto" w:fill="F3F4F6"/>
+                </w:tcPr>
+                <w:p>
+                  <w:pPr>
+                    <w:spacing w:after="20" w:before="0" w:line="252" w:lineRule="auto"/>
+                    <w:jc w:val="center"/>
+                  </w:pPr>
+                  <w:r>
+                    <w:rPr>
+                      <w:rFonts w:ascii="맑은 고딕" w:hAnsi="맑은 고딕" w:eastAsia="맑은 고딕"/>
+                      <w:b/>
+                      <w:sz w:val="17"/>
+                    </w:rPr>
+                    <w:t>태깅 정확도 (%)</w:t>
+                  </w:r>
+                </w:p>
+              </w:tc>
+              <w:tc>
+                <w:tcPr>
+                  <w:tcW w:type="dxa" w:w="1286"/>
+                  <w:shd w:val="clear" w:color="auto" w:fill="F3F4F6"/>
+                </w:tcPr>
+                <w:p>
+                  <w:pPr>
+                    <w:spacing w:after="20" w:before="0" w:line="252" w:lineRule="auto"/>
+                    <w:jc w:val="center"/>
+                  </w:pPr>
+                  <w:r>
+                    <w:rPr>
+                      <w:rFonts w:ascii="맑은 고딕" w:hAnsi="맑은 고딕" w:eastAsia="맑은 고딕"/>
+                      <w:b/>
+                      <w:sz w:val="17"/>
                     </w:rPr>
                     <w:t>허위 POI</w:t>
+                    <w:br/>
+                    <w:t>(FP 중)</w:t>
                   </w:r>
                 </w:p>
               </w:tc>
@@ -2376,74 +1666,112 @@
             <w:tr>
               <w:tc>
                 <w:tcPr>
-                  <w:tcW w:type="dxa" w:w="1800"/>
+                  <w:tcW w:type="dxa" w:w="1286"/>
                 </w:tcPr>
                 <w:p>
                   <w:pPr>
-                    <w:spacing w:after="40"/>
+                    <w:spacing w:after="20" w:before="0" w:line="252" w:lineRule="auto"/>
                   </w:pPr>
                   <w:r>
                     <w:rPr>
                       <w:rFonts w:ascii="맑은 고딕" w:hAnsi="맑은 고딕" w:eastAsia="맑은 고딕"/>
                       <w:b w:val="0"/>
-                      <w:sz w:val="18"/>
+                      <w:sz w:val="17"/>
                     </w:rPr>
-                    <w:t>A (단어: YOLO26x)</w:t>
+                    <w:t>A (YOLO26x)</w:t>
                   </w:r>
                 </w:p>
               </w:tc>
               <w:tc>
                 <w:tcPr>
-                  <w:tcW w:type="dxa" w:w="1800"/>
+                  <w:tcW w:type="dxa" w:w="1286"/>
                 </w:tcPr>
                 <w:p>
                   <w:pPr>
-                    <w:spacing w:after="40"/>
+                    <w:spacing w:after="20" w:before="0" w:line="252" w:lineRule="auto"/>
                     <w:jc w:val="center"/>
                   </w:pPr>
                   <w:r>
                     <w:rPr>
                       <w:rFonts w:ascii="맑은 고딕" w:hAnsi="맑은 고딕" w:eastAsia="맑은 고딕"/>
                       <w:b w:val="0"/>
-                      <w:sz w:val="18"/>
+                      <w:sz w:val="17"/>
                     </w:rPr>
-                    <w:t>77.2 / 0.223</w:t>
+                    <w:t>77.2</w:t>
                   </w:r>
                 </w:p>
               </w:tc>
               <w:tc>
                 <w:tcPr>
-                  <w:tcW w:type="dxa" w:w="1800"/>
+                  <w:tcW w:type="dxa" w:w="1286"/>
                 </w:tcPr>
                 <w:p>
                   <w:pPr>
-                    <w:spacing w:after="40"/>
+                    <w:spacing w:after="20" w:before="0" w:line="252" w:lineRule="auto"/>
                     <w:jc w:val="center"/>
                   </w:pPr>
                   <w:r>
                     <w:rPr>
                       <w:rFonts w:ascii="맑은 고딕" w:hAnsi="맑은 고딕" w:eastAsia="맑은 고딕"/>
                       <w:b w:val="0"/>
-                      <w:sz w:val="18"/>
+                      <w:sz w:val="17"/>
                     </w:rPr>
-                    <w:t>83.6 / 0.121</w:t>
+                    <w:t>0.223</w:t>
                   </w:r>
                 </w:p>
               </w:tc>
               <w:tc>
                 <w:tcPr>
-                  <w:tcW w:type="dxa" w:w="1800"/>
+                  <w:tcW w:type="dxa" w:w="1286"/>
                 </w:tcPr>
                 <w:p>
                   <w:pPr>
-                    <w:spacing w:after="40"/>
+                    <w:spacing w:after="20" w:before="0" w:line="252" w:lineRule="auto"/>
                     <w:jc w:val="center"/>
                   </w:pPr>
                   <w:r>
                     <w:rPr>
                       <w:rFonts w:ascii="맑은 고딕" w:hAnsi="맑은 고딕" w:eastAsia="맑은 고딕"/>
                       <w:b w:val="0"/>
-                      <w:sz w:val="18"/>
+                      <w:sz w:val="17"/>
+                    </w:rPr>
+                    <w:t>83.6</w:t>
+                  </w:r>
+                </w:p>
+              </w:tc>
+              <w:tc>
+                <w:tcPr>
+                  <w:tcW w:type="dxa" w:w="1286"/>
+                </w:tcPr>
+                <w:p>
+                  <w:pPr>
+                    <w:spacing w:after="20" w:before="0" w:line="252" w:lineRule="auto"/>
+                    <w:jc w:val="center"/>
+                  </w:pPr>
+                  <w:r>
+                    <w:rPr>
+                      <w:rFonts w:ascii="맑은 고딕" w:hAnsi="맑은 고딕" w:eastAsia="맑은 고딕"/>
+                      <w:b w:val="0"/>
+                      <w:sz w:val="17"/>
+                    </w:rPr>
+                    <w:t>0.121</w:t>
+                  </w:r>
+                </w:p>
+              </w:tc>
+              <w:tc>
+                <w:tcPr>
+                  <w:tcW w:type="dxa" w:w="1286"/>
+                </w:tcPr>
+                <w:p>
+                  <w:pPr>
+                    <w:spacing w:after="20" w:before="0" w:line="252" w:lineRule="auto"/>
+                    <w:jc w:val="center"/>
+                  </w:pPr>
+                  <w:r>
+                    <w:rPr>
+                      <w:rFonts w:ascii="맑은 고딕" w:hAnsi="맑은 고딕" w:eastAsia="맑은 고딕"/>
+                      <w:b w:val="0"/>
+                      <w:sz w:val="17"/>
                     </w:rPr>
                     <w:t>84.9</w:t>
                   </w:r>
@@ -2451,18 +1779,18 @@
               </w:tc>
               <w:tc>
                 <w:tcPr>
-                  <w:tcW w:type="dxa" w:w="1800"/>
+                  <w:tcW w:type="dxa" w:w="1286"/>
                 </w:tcPr>
                 <w:p>
                   <w:pPr>
-                    <w:spacing w:after="40"/>
+                    <w:spacing w:after="20" w:before="0" w:line="252" w:lineRule="auto"/>
                     <w:jc w:val="center"/>
                   </w:pPr>
                   <w:r>
                     <w:rPr>
                       <w:rFonts w:ascii="맑은 고딕" w:hAnsi="맑은 고딕" w:eastAsia="맑은 고딕"/>
                       <w:b w:val="0"/>
-                      <w:sz w:val="18"/>
+                      <w:sz w:val="17"/>
                     </w:rPr>
                     <w:t>69 / 96</w:t>
                   </w:r>
@@ -2472,74 +1800,112 @@
             <w:tr>
               <w:tc>
                 <w:tcPr>
-                  <w:tcW w:type="dxa" w:w="1800"/>
+                  <w:tcW w:type="dxa" w:w="1286"/>
                 </w:tcPr>
                 <w:p>
                   <w:pPr>
-                    <w:spacing w:after="40"/>
+                    <w:spacing w:after="20" w:before="0" w:line="252" w:lineRule="auto"/>
                   </w:pPr>
                   <w:r>
                     <w:rPr>
                       <w:rFonts w:ascii="맑은 고딕" w:hAnsi="맑은 고딕" w:eastAsia="맑은 고딕"/>
                       <w:b w:val="0"/>
-                      <w:sz w:val="18"/>
+                      <w:sz w:val="17"/>
                     </w:rPr>
-                    <w:t>B (단어: YOLOv5x)</w:t>
+                    <w:t>B (YOLOv5x)</w:t>
                   </w:r>
                 </w:p>
               </w:tc>
               <w:tc>
                 <w:tcPr>
-                  <w:tcW w:type="dxa" w:w="1800"/>
+                  <w:tcW w:type="dxa" w:w="1286"/>
                 </w:tcPr>
                 <w:p>
                   <w:pPr>
-                    <w:spacing w:after="40"/>
+                    <w:spacing w:after="20" w:before="0" w:line="252" w:lineRule="auto"/>
                     <w:jc w:val="center"/>
                   </w:pPr>
                   <w:r>
                     <w:rPr>
                       <w:rFonts w:ascii="맑은 고딕" w:hAnsi="맑은 고딕" w:eastAsia="맑은 고딕"/>
                       <w:b w:val="0"/>
-                      <w:sz w:val="18"/>
+                      <w:sz w:val="17"/>
                     </w:rPr>
-                    <w:t>75.1 / 0.241</w:t>
+                    <w:t>75.1</w:t>
                   </w:r>
                 </w:p>
               </w:tc>
               <w:tc>
                 <w:tcPr>
-                  <w:tcW w:type="dxa" w:w="1800"/>
+                  <w:tcW w:type="dxa" w:w="1286"/>
                 </w:tcPr>
                 <w:p>
                   <w:pPr>
-                    <w:spacing w:after="40"/>
+                    <w:spacing w:after="20" w:before="0" w:line="252" w:lineRule="auto"/>
                     <w:jc w:val="center"/>
                   </w:pPr>
                   <w:r>
                     <w:rPr>
                       <w:rFonts w:ascii="맑은 고딕" w:hAnsi="맑은 고딕" w:eastAsia="맑은 고딕"/>
                       <w:b w:val="0"/>
-                      <w:sz w:val="18"/>
+                      <w:sz w:val="17"/>
                     </w:rPr>
-                    <w:t>82.4 / 0.133</w:t>
+                    <w:t>0.241</w:t>
                   </w:r>
                 </w:p>
               </w:tc>
               <w:tc>
                 <w:tcPr>
-                  <w:tcW w:type="dxa" w:w="1800"/>
+                  <w:tcW w:type="dxa" w:w="1286"/>
                 </w:tcPr>
                 <w:p>
                   <w:pPr>
-                    <w:spacing w:after="40"/>
+                    <w:spacing w:after="20" w:before="0" w:line="252" w:lineRule="auto"/>
                     <w:jc w:val="center"/>
                   </w:pPr>
                   <w:r>
                     <w:rPr>
                       <w:rFonts w:ascii="맑은 고딕" w:hAnsi="맑은 고딕" w:eastAsia="맑은 고딕"/>
                       <w:b w:val="0"/>
-                      <w:sz w:val="18"/>
+                      <w:sz w:val="17"/>
+                    </w:rPr>
+                    <w:t>82.4</w:t>
+                  </w:r>
+                </w:p>
+              </w:tc>
+              <w:tc>
+                <w:tcPr>
+                  <w:tcW w:type="dxa" w:w="1286"/>
+                </w:tcPr>
+                <w:p>
+                  <w:pPr>
+                    <w:spacing w:after="20" w:before="0" w:line="252" w:lineRule="auto"/>
+                    <w:jc w:val="center"/>
+                  </w:pPr>
+                  <w:r>
+                    <w:rPr>
+                      <w:rFonts w:ascii="맑은 고딕" w:hAnsi="맑은 고딕" w:eastAsia="맑은 고딕"/>
+                      <w:b w:val="0"/>
+                      <w:sz w:val="17"/>
+                    </w:rPr>
+                    <w:t>0.133</w:t>
+                  </w:r>
+                </w:p>
+              </w:tc>
+              <w:tc>
+                <w:tcPr>
+                  <w:tcW w:type="dxa" w:w="1286"/>
+                </w:tcPr>
+                <w:p>
+                  <w:pPr>
+                    <w:spacing w:after="20" w:before="0" w:line="252" w:lineRule="auto"/>
+                    <w:jc w:val="center"/>
+                  </w:pPr>
+                  <w:r>
+                    <w:rPr>
+                      <w:rFonts w:ascii="맑은 고딕" w:hAnsi="맑은 고딕" w:eastAsia="맑은 고딕"/>
+                      <w:b w:val="0"/>
+                      <w:sz w:val="17"/>
                     </w:rPr>
                     <w:t>85.5</w:t>
                   </w:r>
@@ -2547,18 +1913,18 @@
               </w:tc>
               <w:tc>
                 <w:tcPr>
-                  <w:tcW w:type="dxa" w:w="1800"/>
+                  <w:tcW w:type="dxa" w:w="1286"/>
                 </w:tcPr>
                 <w:p>
                   <w:pPr>
-                    <w:spacing w:after="40"/>
+                    <w:spacing w:after="20" w:before="0" w:line="252" w:lineRule="auto"/>
                     <w:jc w:val="center"/>
                   </w:pPr>
                   <w:r>
                     <w:rPr>
                       <w:rFonts w:ascii="맑은 고딕" w:hAnsi="맑은 고딕" w:eastAsia="맑은 고딕"/>
                       <w:b w:val="0"/>
-                      <w:sz w:val="18"/>
+                      <w:sz w:val="17"/>
                     </w:rPr>
                     <w:t>67 / 96</w:t>
                   </w:r>
@@ -2569,15 +1935,15 @@
           <w:p/>
           <w:p>
             <w:pPr>
-              <w:spacing w:after="40"/>
+              <w:spacing w:after="0" w:line="80" w:lineRule="exact"/>
             </w:pPr>
           </w:p>
         </w:tc>
       </w:tr>
     </w:tbl>
     <w:sectPr>
-      <w:pgSz w:w="12240" w:h="15840"/>
-      <w:pgMar w:top="864" w:right="864" w:bottom="864" w:left="864" w:header="720" w:footer="720" w:gutter="0"/>
+      <w:pgSz w:w="11909" w:h="16834"/>
+      <w:pgMar w:top="648" w:right="792" w:bottom="648" w:left="792" w:header="720" w:footer="720" w:gutter="0"/>
       <w:cols w:space="720"/>
       <w:docGrid w:linePitch="360"/>
     </w:sectPr>

</xml_diff>

<commit_message>
KIIS 2026 form draft: simpler wording, no dashes
Co-Authored-By: Claude Opus 5.5 <noreply@anthropic.com>
</commit_message>
<xml_diff>
--- a/docs/KIIS2026_GSV_OSM_초고.docx
+++ b/docs/KIIS2026_GSV_OSM_초고.docx
@@ -216,7 +216,7 @@
                 <w:b w:val="0"/>
                 <w:sz w:val="18"/>
               </w:rPr>
-              <w:t>- 모듈형 프레임워크: 간판 검출 → 단어 박스 검출 → 라인 병합 → OCR → VLM 교정 → 의미 태깅 → OSM 태그</w:t>
+              <w:t>• 간판 검출, 단어 박스 검출, OCR, VLM 교정, 업종 태깅으로 이루어진 모듈형 프레임워크</w:t>
             </w:r>
           </w:p>
           <w:p>
@@ -229,7 +229,7 @@
                 <w:b w:val="0"/>
                 <w:sz w:val="18"/>
               </w:rPr>
-              <w:t>- 데이터: GSV 298장(강남 99·브루클린 99·수원 100), 간판 453 · 단어 박스 1,467 · OCR 592 라인 · 태깅 377</w:t>
+              <w:t>• 파이프라인 A는 단어 박스 검출에 YOLO26x, 파이프라인 B는 YOLOv5x를 사용</w:t>
             </w:r>
           </w:p>
           <w:p>
@@ -242,20 +242,7 @@
                 <w:b w:val="0"/>
                 <w:sz w:val="18"/>
               </w:rPr>
-              <w:t>- 파이프라인 A: 단어 박스 검출 YOLO26x, B: YOLOv5x (두 검출기 성능 차이가 없어 둘 다 평가)</w:t>
-            </w:r>
-          </w:p>
-          <w:p>
-            <w:pPr>
-              <w:spacing w:after="20" w:before="0" w:line="252" w:lineRule="auto"/>
-            </w:pPr>
-            <w:r>
-              <w:rPr>
-                <w:rFonts w:ascii="맑은 고딕" w:hAnsi="맑은 고딕" w:eastAsia="맑은 고딕"/>
-                <w:b w:val="0"/>
-                <w:sz w:val="18"/>
-              </w:rPr>
-              <w:t>[검출기 3종: 간판 검출(GSV, group-aware 5-fold) · 단어 박스 검출]</w:t>
+              <w:t>[검출기 비교]</w:t>
             </w:r>
           </w:p>
           <w:tbl>
@@ -265,16 +252,15 @@
               <w:tblLook w:firstColumn="1" w:firstRow="1" w:lastColumn="0" w:lastRow="0" w:noHBand="0" w:noVBand="1" w:val="04A0"/>
             </w:tblPr>
             <w:tblGrid>
-              <w:gridCol w:w="1800"/>
-              <w:gridCol w:w="1800"/>
-              <w:gridCol w:w="1800"/>
-              <w:gridCol w:w="1800"/>
-              <w:gridCol w:w="1800"/>
+              <w:gridCol w:w="2250"/>
+              <w:gridCol w:w="2250"/>
+              <w:gridCol w:w="2250"/>
+              <w:gridCol w:w="2250"/>
             </w:tblGrid>
             <w:tr>
               <w:tc>
                 <w:tcPr>
-                  <w:tcW w:type="dxa" w:w="1800"/>
+                  <w:tcW w:type="dxa" w:w="2250"/>
                   <w:shd w:val="clear" w:color="auto" w:fill="F3F4F6"/>
                 </w:tcPr>
                 <w:p>
@@ -294,7 +280,7 @@
               </w:tc>
               <w:tc>
                 <w:tcPr>
-                  <w:tcW w:type="dxa" w:w="1800"/>
+                  <w:tcW w:type="dxa" w:w="2250"/>
                   <w:shd w:val="clear" w:color="auto" w:fill="F3F4F6"/>
                 </w:tcPr>
                 <w:p>
@@ -316,7 +302,7 @@
               </w:tc>
               <w:tc>
                 <w:tcPr>
-                  <w:tcW w:type="dxa" w:w="1800"/>
+                  <w:tcW w:type="dxa" w:w="2250"/>
                   <w:shd w:val="clear" w:color="auto" w:fill="F3F4F6"/>
                 </w:tcPr>
                 <w:p>
@@ -330,15 +316,15 @@
                       <w:b/>
                       <w:sz w:val="17"/>
                     </w:rPr>
-                    <w:t>단어 박스 AP@0.5</w:t>
+                    <w:t>단어 박스 검출</w:t>
                     <w:br/>
-                    <w:t>(AI Hub 시험셋)</w:t>
+                    <w:t>AP@0.5 (AI Hub)</w:t>
                   </w:r>
                 </w:p>
               </w:tc>
               <w:tc>
                 <w:tcPr>
-                  <w:tcW w:type="dxa" w:w="1800"/>
+                  <w:tcW w:type="dxa" w:w="2250"/>
                   <w:shd w:val="clear" w:color="auto" w:fill="F3F4F6"/>
                 </w:tcPr>
                 <w:p>
@@ -352,31 +338,9 @@
                       <w:b/>
                       <w:sz w:val="17"/>
                     </w:rPr>
-                    <w:t>단어 박스 AP@0.5</w:t>
+                    <w:t>단어 박스 검출</w:t>
                     <w:br/>
-                    <w:t>(GSV 정답 간판)</w:t>
-                  </w:r>
-                </w:p>
-              </w:tc>
-              <w:tc>
-                <w:tcPr>
-                  <w:tcW w:type="dxa" w:w="1800"/>
-                  <w:shd w:val="clear" w:color="auto" w:fill="F3F4F6"/>
-                </w:tcPr>
-                <w:p>
-                  <w:pPr>
-                    <w:spacing w:after="20" w:before="0" w:line="252" w:lineRule="auto"/>
-                    <w:jc w:val="center"/>
-                  </w:pPr>
-                  <w:r>
-                    <w:rPr>
-                      <w:rFonts w:ascii="맑은 고딕" w:hAnsi="맑은 고딕" w:eastAsia="맑은 고딕"/>
-                      <w:b/>
-                      <w:sz w:val="17"/>
-                    </w:rPr>
-                    <w:t>단어 박스 AP@0.5</w:t>
-                    <w:br/>
-                    <w:t>(간판 검출 연쇄)</w:t>
+                    <w:t>AP@0.5 (GSV)</w:t>
                   </w:r>
                 </w:p>
               </w:tc>
@@ -384,7 +348,7 @@
             <w:tr>
               <w:tc>
                 <w:tcPr>
-                  <w:tcW w:type="dxa" w:w="1800"/>
+                  <w:tcW w:type="dxa" w:w="2250"/>
                 </w:tcPr>
                 <w:p>
                   <w:pPr>
@@ -402,7 +366,7 @@
               </w:tc>
               <w:tc>
                 <w:tcPr>
-                  <w:tcW w:type="dxa" w:w="1800"/>
+                  <w:tcW w:type="dxa" w:w="2250"/>
                 </w:tcPr>
                 <w:p>
                   <w:pPr>
@@ -421,7 +385,7 @@
               </w:tc>
               <w:tc>
                 <w:tcPr>
-                  <w:tcW w:type="dxa" w:w="1800"/>
+                  <w:tcW w:type="dxa" w:w="2250"/>
                 </w:tcPr>
                 <w:p>
                   <w:pPr>
@@ -440,7 +404,7 @@
               </w:tc>
               <w:tc>
                 <w:tcPr>
-                  <w:tcW w:type="dxa" w:w="1800"/>
+                  <w:tcW w:type="dxa" w:w="2250"/>
                 </w:tcPr>
                 <w:p>
                   <w:pPr>
@@ -457,30 +421,11 @@
                   </w:r>
                 </w:p>
               </w:tc>
-              <w:tc>
-                <w:tcPr>
-                  <w:tcW w:type="dxa" w:w="1800"/>
-                </w:tcPr>
-                <w:p>
-                  <w:pPr>
-                    <w:spacing w:after="20" w:before="0" w:line="252" w:lineRule="auto"/>
-                    <w:jc w:val="center"/>
-                  </w:pPr>
-                  <w:r>
-                    <w:rPr>
-                      <w:rFonts w:ascii="맑은 고딕" w:hAnsi="맑은 고딕" w:eastAsia="맑은 고딕"/>
-                      <w:b/>
-                      <w:sz w:val="17"/>
-                    </w:rPr>
-                    <w:t>0.740</w:t>
-                  </w:r>
-                </w:p>
-              </w:tc>
             </w:tr>
             <w:tr>
               <w:tc>
                 <w:tcPr>
-                  <w:tcW w:type="dxa" w:w="1800"/>
+                  <w:tcW w:type="dxa" w:w="2250"/>
                 </w:tcPr>
                 <w:p>
                   <w:pPr>
@@ -498,7 +443,7 @@
               </w:tc>
               <w:tc>
                 <w:tcPr>
-                  <w:tcW w:type="dxa" w:w="1800"/>
+                  <w:tcW w:type="dxa" w:w="2250"/>
                 </w:tcPr>
                 <w:p>
                   <w:pPr>
@@ -517,7 +462,7 @@
               </w:tc>
               <w:tc>
                 <w:tcPr>
-                  <w:tcW w:type="dxa" w:w="1800"/>
+                  <w:tcW w:type="dxa" w:w="2250"/>
                 </w:tcPr>
                 <w:p>
                   <w:pPr>
@@ -536,7 +481,7 @@
               </w:tc>
               <w:tc>
                 <w:tcPr>
-                  <w:tcW w:type="dxa" w:w="1800"/>
+                  <w:tcW w:type="dxa" w:w="2250"/>
                 </w:tcPr>
                 <w:p>
                   <w:pPr>
@@ -553,30 +498,11 @@
                   </w:r>
                 </w:p>
               </w:tc>
-              <w:tc>
-                <w:tcPr>
-                  <w:tcW w:type="dxa" w:w="1800"/>
-                </w:tcPr>
-                <w:p>
-                  <w:pPr>
-                    <w:spacing w:after="20" w:before="0" w:line="252" w:lineRule="auto"/>
-                    <w:jc w:val="center"/>
-                  </w:pPr>
-                  <w:r>
-                    <w:rPr>
-                      <w:rFonts w:ascii="맑은 고딕" w:hAnsi="맑은 고딕" w:eastAsia="맑은 고딕"/>
-                      <w:b w:val="0"/>
-                      <w:sz w:val="17"/>
-                    </w:rPr>
-                    <w:t>0.745</w:t>
-                  </w:r>
-                </w:p>
-              </w:tc>
             </w:tr>
             <w:tr>
               <w:tc>
                 <w:tcPr>
-                  <w:tcW w:type="dxa" w:w="1800"/>
+                  <w:tcW w:type="dxa" w:w="2250"/>
                 </w:tcPr>
                 <w:p>
                   <w:pPr>
@@ -594,7 +520,7 @@
               </w:tc>
               <w:tc>
                 <w:tcPr>
-                  <w:tcW w:type="dxa" w:w="1800"/>
+                  <w:tcW w:type="dxa" w:w="2250"/>
                 </w:tcPr>
                 <w:p>
                   <w:pPr>
@@ -613,7 +539,7 @@
               </w:tc>
               <w:tc>
                 <w:tcPr>
-                  <w:tcW w:type="dxa" w:w="1800"/>
+                  <w:tcW w:type="dxa" w:w="2250"/>
                 </w:tcPr>
                 <w:p>
                   <w:pPr>
@@ -632,7 +558,7 @@
               </w:tc>
               <w:tc>
                 <w:tcPr>
-                  <w:tcW w:type="dxa" w:w="1800"/>
+                  <w:tcW w:type="dxa" w:w="2250"/>
                 </w:tcPr>
                 <w:p>
                   <w:pPr>
@@ -646,25 +572,6 @@
                       <w:sz w:val="17"/>
                     </w:rPr>
                     <w:t>0.827</w:t>
-                  </w:r>
-                </w:p>
-              </w:tc>
-              <w:tc>
-                <w:tcPr>
-                  <w:tcW w:type="dxa" w:w="1800"/>
-                </w:tcPr>
-                <w:p>
-                  <w:pPr>
-                    <w:spacing w:after="20" w:before="0" w:line="252" w:lineRule="auto"/>
-                    <w:jc w:val="center"/>
-                  </w:pPr>
-                  <w:r>
-                    <w:rPr>
-                      <w:rFonts w:ascii="맑은 고딕" w:hAnsi="맑은 고딕" w:eastAsia="맑은 고딕"/>
-                      <w:b w:val="0"/>
-                      <w:sz w:val="17"/>
-                    </w:rPr>
-                    <w:t>0.696</w:t>
                   </w:r>
                 </w:p>
               </w:tc>
@@ -686,7 +593,7 @@
                 <w:b w:val="0"/>
                 <w:sz w:val="18"/>
               </w:rPr>
-              <w:t>[OCR 3종 (단어 62,464 + 라인 13,148로 미세조정) · VLM 2종 교정(SVTRv2-B 출력) — fixtext: 텍스트만, fix: 이미지 + 텍스트]</w:t>
+              <w:t>[OCR 및 VLM 교정 비교]</w:t>
             </w:r>
           </w:p>
           <w:tbl>
@@ -696,16 +603,15 @@
               <w:tblLook w:firstColumn="1" w:firstRow="1" w:lastColumn="0" w:lastRow="0" w:noHBand="0" w:noVBand="1" w:val="04A0"/>
             </w:tblPr>
             <w:tblGrid>
-              <w:gridCol w:w="1800"/>
-              <w:gridCol w:w="1800"/>
-              <w:gridCol w:w="1800"/>
-              <w:gridCol w:w="1800"/>
-              <w:gridCol w:w="1800"/>
+              <w:gridCol w:w="2250"/>
+              <w:gridCol w:w="2250"/>
+              <w:gridCol w:w="2250"/>
+              <w:gridCol w:w="2250"/>
             </w:tblGrid>
             <w:tr>
               <w:tc>
                 <w:tcPr>
-                  <w:tcW w:type="dxa" w:w="1440"/>
+                  <w:tcW w:type="dxa" w:w="2880"/>
                   <w:shd w:val="clear" w:color="auto" w:fill="F3F4F6"/>
                 </w:tcPr>
                 <w:p>
@@ -719,13 +625,13 @@
                       <w:b/>
                       <w:sz w:val="17"/>
                     </w:rPr>
-                    <w:t>단계</w:t>
+                    <w:t>구분</w:t>
                   </w:r>
                 </w:p>
               </w:tc>
               <w:tc>
                 <w:tcPr>
-                  <w:tcW w:type="dxa" w:w="2592"/>
+                  <w:tcW w:type="dxa" w:w="2448"/>
                   <w:shd w:val="clear" w:color="auto" w:fill="F3F4F6"/>
                 </w:tcPr>
                 <w:p>
@@ -745,27 +651,7 @@
               </w:tc>
               <w:tc>
                 <w:tcPr>
-                  <w:tcW w:type="dxa" w:w="1296"/>
-                  <w:shd w:val="clear" w:color="auto" w:fill="F3F4F6"/>
-                </w:tcPr>
-                <w:p>
-                  <w:pPr>
-                    <w:spacing w:after="20" w:before="0" w:line="252" w:lineRule="auto"/>
-                    <w:jc w:val="center"/>
-                  </w:pPr>
-                  <w:r>
-                    <w:rPr>
-                      <w:rFonts w:ascii="맑은 고딕" w:hAnsi="맑은 고딕" w:eastAsia="맑은 고딕"/>
-                      <w:b/>
-                      <w:sz w:val="17"/>
-                    </w:rPr>
-                    <w:t>방법</w:t>
-                  </w:r>
-                </w:p>
-              </w:tc>
-              <w:tc>
-                <w:tcPr>
-                  <w:tcW w:type="dxa" w:w="1728"/>
+                  <w:tcW w:type="dxa" w:w="1872"/>
                   <w:shd w:val="clear" w:color="auto" w:fill="F3F4F6"/>
                 </w:tcPr>
                 <w:p>
@@ -807,7 +693,7 @@
             <w:tr>
               <w:tc>
                 <w:tcPr>
-                  <w:tcW w:type="dxa" w:w="1440"/>
+                  <w:tcW w:type="dxa" w:w="2880"/>
                 </w:tcPr>
                 <w:p>
                   <w:pPr>
@@ -825,7 +711,7 @@
               </w:tc>
               <w:tc>
                 <w:tcPr>
-                  <w:tcW w:type="dxa" w:w="2592"/>
+                  <w:tcW w:type="dxa" w:w="2448"/>
                 </w:tcPr>
                 <w:p>
                   <w:pPr>
@@ -844,26 +730,7 @@
               </w:tc>
               <w:tc>
                 <w:tcPr>
-                  <w:tcW w:type="dxa" w:w="1296"/>
-                </w:tcPr>
-                <w:p>
-                  <w:pPr>
-                    <w:spacing w:after="20" w:before="0" w:line="252" w:lineRule="auto"/>
-                    <w:jc w:val="center"/>
-                  </w:pPr>
-                  <w:r>
-                    <w:rPr>
-                      <w:rFonts w:ascii="맑은 고딕" w:hAnsi="맑은 고딕" w:eastAsia="맑은 고딕"/>
-                      <w:b/>
-                      <w:sz w:val="17"/>
-                    </w:rPr>
-                    <w:t>—</w:t>
-                  </w:r>
-                </w:p>
-              </w:tc>
-              <w:tc>
-                <w:tcPr>
-                  <w:tcW w:type="dxa" w:w="1728"/>
+                  <w:tcW w:type="dxa" w:w="1872"/>
                 </w:tcPr>
                 <w:p>
                   <w:pPr>
@@ -903,7 +770,7 @@
             <w:tr>
               <w:tc>
                 <w:tcPr>
-                  <w:tcW w:type="dxa" w:w="1440"/>
+                  <w:tcW w:type="dxa" w:w="2880"/>
                 </w:tcPr>
                 <w:p>
                   <w:pPr>
@@ -921,7 +788,7 @@
               </w:tc>
               <w:tc>
                 <w:tcPr>
-                  <w:tcW w:type="dxa" w:w="2592"/>
+                  <w:tcW w:type="dxa" w:w="2448"/>
                 </w:tcPr>
                 <w:p>
                   <w:pPr>
@@ -934,32 +801,13 @@
                       <w:b w:val="0"/>
                       <w:sz w:val="17"/>
                     </w:rPr>
-                    <w:t>PaddleOCR PP-OCRv5</w:t>
+                    <w:t>PaddleOCR</w:t>
                   </w:r>
                 </w:p>
               </w:tc>
               <w:tc>
                 <w:tcPr>
-                  <w:tcW w:type="dxa" w:w="1296"/>
-                </w:tcPr>
-                <w:p>
-                  <w:pPr>
-                    <w:spacing w:after="20" w:before="0" w:line="252" w:lineRule="auto"/>
-                    <w:jc w:val="center"/>
-                  </w:pPr>
-                  <w:r>
-                    <w:rPr>
-                      <w:rFonts w:ascii="맑은 고딕" w:hAnsi="맑은 고딕" w:eastAsia="맑은 고딕"/>
-                      <w:b w:val="0"/>
-                      <w:sz w:val="17"/>
-                    </w:rPr>
-                    <w:t>—</w:t>
-                  </w:r>
-                </w:p>
-              </w:tc>
-              <w:tc>
-                <w:tcPr>
-                  <w:tcW w:type="dxa" w:w="1728"/>
+                  <w:tcW w:type="dxa" w:w="1872"/>
                 </w:tcPr>
                 <w:p>
                   <w:pPr>
@@ -999,7 +847,7 @@
             <w:tr>
               <w:tc>
                 <w:tcPr>
-                  <w:tcW w:type="dxa" w:w="1440"/>
+                  <w:tcW w:type="dxa" w:w="2880"/>
                 </w:tcPr>
                 <w:p>
                   <w:pPr>
@@ -1017,7 +865,7 @@
               </w:tc>
               <w:tc>
                 <w:tcPr>
-                  <w:tcW w:type="dxa" w:w="2592"/>
+                  <w:tcW w:type="dxa" w:w="2448"/>
                 </w:tcPr>
                 <w:p>
                   <w:pPr>
@@ -1030,32 +878,13 @@
                       <w:b w:val="0"/>
                       <w:sz w:val="17"/>
                     </w:rPr>
-                    <w:t>PARSeq (ViT-S)</w:t>
+                    <w:t>PARSeq</w:t>
                   </w:r>
                 </w:p>
               </w:tc>
               <w:tc>
                 <w:tcPr>
-                  <w:tcW w:type="dxa" w:w="1296"/>
-                </w:tcPr>
-                <w:p>
-                  <w:pPr>
-                    <w:spacing w:after="20" w:before="0" w:line="252" w:lineRule="auto"/>
-                    <w:jc w:val="center"/>
-                  </w:pPr>
-                  <w:r>
-                    <w:rPr>
-                      <w:rFonts w:ascii="맑은 고딕" w:hAnsi="맑은 고딕" w:eastAsia="맑은 고딕"/>
-                      <w:b w:val="0"/>
-                      <w:sz w:val="17"/>
-                    </w:rPr>
-                    <w:t>—</w:t>
-                  </w:r>
-                </w:p>
-              </w:tc>
-              <w:tc>
-                <w:tcPr>
-                  <w:tcW w:type="dxa" w:w="1728"/>
+                  <w:tcW w:type="dxa" w:w="1872"/>
                 </w:tcPr>
                 <w:p>
                   <w:pPr>
@@ -1095,7 +924,7 @@
             <w:tr>
               <w:tc>
                 <w:tcPr>
-                  <w:tcW w:type="dxa" w:w="1440"/>
+                  <w:tcW w:type="dxa" w:w="2880"/>
                 </w:tcPr>
                 <w:p>
                   <w:pPr>
@@ -1107,13 +936,13 @@
                       <w:b w:val="0"/>
                       <w:sz w:val="17"/>
                     </w:rPr>
-                    <w:t>VLM 교정</w:t>
+                    <w:t>VLM 교정 (텍스트만)</w:t>
                   </w:r>
                 </w:p>
               </w:tc>
               <w:tc>
                 <w:tcPr>
-                  <w:tcW w:type="dxa" w:w="2592"/>
+                  <w:tcW w:type="dxa" w:w="2448"/>
                 </w:tcPr>
                 <w:p>
                   <w:pPr>
@@ -1132,26 +961,7 @@
               </w:tc>
               <w:tc>
                 <w:tcPr>
-                  <w:tcW w:type="dxa" w:w="1296"/>
-                </w:tcPr>
-                <w:p>
-                  <w:pPr>
-                    <w:spacing w:after="20" w:before="0" w:line="252" w:lineRule="auto"/>
-                    <w:jc w:val="center"/>
-                  </w:pPr>
-                  <w:r>
-                    <w:rPr>
-                      <w:rFonts w:ascii="맑은 고딕" w:hAnsi="맑은 고딕" w:eastAsia="맑은 고딕"/>
-                      <w:b w:val="0"/>
-                      <w:sz w:val="17"/>
-                    </w:rPr>
-                    <w:t>fixtext</w:t>
-                  </w:r>
-                </w:p>
-              </w:tc>
-              <w:tc>
-                <w:tcPr>
-                  <w:tcW w:type="dxa" w:w="1728"/>
+                  <w:tcW w:type="dxa" w:w="1872"/>
                 </w:tcPr>
                 <w:p>
                   <w:pPr>
@@ -1191,7 +1001,7 @@
             <w:tr>
               <w:tc>
                 <w:tcPr>
-                  <w:tcW w:type="dxa" w:w="1440"/>
+                  <w:tcW w:type="dxa" w:w="2880"/>
                 </w:tcPr>
                 <w:p>
                   <w:pPr>
@@ -1203,13 +1013,13 @@
                       <w:b/>
                       <w:sz w:val="17"/>
                     </w:rPr>
-                    <w:t>VLM 교정</w:t>
+                    <w:t>VLM 교정 (이미지 + 텍스트)</w:t>
                   </w:r>
                 </w:p>
               </w:tc>
               <w:tc>
                 <w:tcPr>
-                  <w:tcW w:type="dxa" w:w="2592"/>
+                  <w:tcW w:type="dxa" w:w="2448"/>
                 </w:tcPr>
                 <w:p>
                   <w:pPr>
@@ -1228,26 +1038,7 @@
               </w:tc>
               <w:tc>
                 <w:tcPr>
-                  <w:tcW w:type="dxa" w:w="1296"/>
-                </w:tcPr>
-                <w:p>
-                  <w:pPr>
-                    <w:spacing w:after="20" w:before="0" w:line="252" w:lineRule="auto"/>
-                    <w:jc w:val="center"/>
-                  </w:pPr>
-                  <w:r>
-                    <w:rPr>
-                      <w:rFonts w:ascii="맑은 고딕" w:hAnsi="맑은 고딕" w:eastAsia="맑은 고딕"/>
-                      <w:b/>
-                      <w:sz w:val="17"/>
-                    </w:rPr>
-                    <w:t>fix</w:t>
-                  </w:r>
-                </w:p>
-              </w:tc>
-              <w:tc>
-                <w:tcPr>
-                  <w:tcW w:type="dxa" w:w="1728"/>
+                  <w:tcW w:type="dxa" w:w="1872"/>
                 </w:tcPr>
                 <w:p>
                   <w:pPr>
@@ -1287,7 +1078,7 @@
             <w:tr>
               <w:tc>
                 <w:tcPr>
-                  <w:tcW w:type="dxa" w:w="1440"/>
+                  <w:tcW w:type="dxa" w:w="2880"/>
                 </w:tcPr>
                 <w:p>
                   <w:pPr>
@@ -1299,13 +1090,13 @@
                       <w:b w:val="0"/>
                       <w:sz w:val="17"/>
                     </w:rPr>
-                    <w:t>VLM 교정</w:t>
+                    <w:t>VLM 교정 (텍스트만)</w:t>
                   </w:r>
                 </w:p>
               </w:tc>
               <w:tc>
                 <w:tcPr>
-                  <w:tcW w:type="dxa" w:w="2592"/>
+                  <w:tcW w:type="dxa" w:w="2448"/>
                 </w:tcPr>
                 <w:p>
                   <w:pPr>
@@ -1324,26 +1115,7 @@
               </w:tc>
               <w:tc>
                 <w:tcPr>
-                  <w:tcW w:type="dxa" w:w="1296"/>
-                </w:tcPr>
-                <w:p>
-                  <w:pPr>
-                    <w:spacing w:after="20" w:before="0" w:line="252" w:lineRule="auto"/>
-                    <w:jc w:val="center"/>
-                  </w:pPr>
-                  <w:r>
-                    <w:rPr>
-                      <w:rFonts w:ascii="맑은 고딕" w:hAnsi="맑은 고딕" w:eastAsia="맑은 고딕"/>
-                      <w:b w:val="0"/>
-                      <w:sz w:val="17"/>
-                    </w:rPr>
-                    <w:t>fixtext</w:t>
-                  </w:r>
-                </w:p>
-              </w:tc>
-              <w:tc>
-                <w:tcPr>
-                  <w:tcW w:type="dxa" w:w="1728"/>
+                  <w:tcW w:type="dxa" w:w="1872"/>
                 </w:tcPr>
                 <w:p>
                   <w:pPr>
@@ -1383,7 +1155,7 @@
             <w:tr>
               <w:tc>
                 <w:tcPr>
-                  <w:tcW w:type="dxa" w:w="1440"/>
+                  <w:tcW w:type="dxa" w:w="2880"/>
                 </w:tcPr>
                 <w:p>
                   <w:pPr>
@@ -1395,13 +1167,13 @@
                       <w:b w:val="0"/>
                       <w:sz w:val="17"/>
                     </w:rPr>
-                    <w:t>VLM 교정</w:t>
+                    <w:t>VLM 교정 (이미지 + 텍스트)</w:t>
                   </w:r>
                 </w:p>
               </w:tc>
               <w:tc>
                 <w:tcPr>
-                  <w:tcW w:type="dxa" w:w="2592"/>
+                  <w:tcW w:type="dxa" w:w="2448"/>
                 </w:tcPr>
                 <w:p>
                   <w:pPr>
@@ -1420,26 +1192,7 @@
               </w:tc>
               <w:tc>
                 <w:tcPr>
-                  <w:tcW w:type="dxa" w:w="1296"/>
-                </w:tcPr>
-                <w:p>
-                  <w:pPr>
-                    <w:spacing w:after="20" w:before="0" w:line="252" w:lineRule="auto"/>
-                    <w:jc w:val="center"/>
-                  </w:pPr>
-                  <w:r>
-                    <w:rPr>
-                      <w:rFonts w:ascii="맑은 고딕" w:hAnsi="맑은 고딕" w:eastAsia="맑은 고딕"/>
-                      <w:b w:val="0"/>
-                      <w:sz w:val="17"/>
-                    </w:rPr>
-                    <w:t>fix</w:t>
-                  </w:r>
-                </w:p>
-              </w:tc>
-              <w:tc>
-                <w:tcPr>
-                  <w:tcW w:type="dxa" w:w="1728"/>
+                  <w:tcW w:type="dxa" w:w="1872"/>
                 </w:tcPr>
                 <w:p>
                   <w:pPr>
@@ -1493,7 +1246,7 @@
                 <w:b w:val="0"/>
                 <w:sz w:val="18"/>
               </w:rPr>
-              <w:t>[전체 파이프라인: 간판 검출 YOLO26x — TP 374 / FN 79 / FP 96, OCR = SVTRv2-B + Gemma 4 fix]</w:t>
+              <w:t>[전체 파이프라인 결과]</w:t>
             </w:r>
           </w:p>
           <w:tbl>
@@ -1503,18 +1256,15 @@
               <w:tblLook w:firstColumn="1" w:firstRow="1" w:lastColumn="0" w:lastRow="0" w:noHBand="0" w:noVBand="1" w:val="04A0"/>
             </w:tblPr>
             <w:tblGrid>
-              <w:gridCol w:w="1286"/>
-              <w:gridCol w:w="1286"/>
-              <w:gridCol w:w="1286"/>
-              <w:gridCol w:w="1286"/>
-              <w:gridCol w:w="1286"/>
-              <w:gridCol w:w="1286"/>
-              <w:gridCol w:w="1286"/>
+              <w:gridCol w:w="2250"/>
+              <w:gridCol w:w="2250"/>
+              <w:gridCol w:w="2250"/>
+              <w:gridCol w:w="2250"/>
             </w:tblGrid>
             <w:tr>
               <w:tc>
                 <w:tcPr>
-                  <w:tcW w:type="dxa" w:w="1286"/>
+                  <w:tcW w:type="dxa" w:w="2250"/>
                   <w:shd w:val="clear" w:color="auto" w:fill="F3F4F6"/>
                 </w:tcPr>
                 <w:p>
@@ -1534,7 +1284,7 @@
               </w:tc>
               <w:tc>
                 <w:tcPr>
-                  <w:tcW w:type="dxa" w:w="1286"/>
+                  <w:tcW w:type="dxa" w:w="2250"/>
                   <w:shd w:val="clear" w:color="auto" w:fill="F3F4F6"/>
                 </w:tcPr>
                 <w:p>
@@ -1550,13 +1300,13 @@
                     </w:rPr>
                     <w:t>line exact (%)</w:t>
                     <w:br/>
-                    <w:t>검출 간판</w:t>
+                    <w:t>(검출된 간판)</w:t>
                   </w:r>
                 </w:p>
               </w:tc>
               <w:tc>
                 <w:tcPr>
-                  <w:tcW w:type="dxa" w:w="1286"/>
+                  <w:tcW w:type="dxa" w:w="2250"/>
                   <w:shd w:val="clear" w:color="auto" w:fill="F3F4F6"/>
                 </w:tcPr>
                 <w:p>
@@ -1572,13 +1322,13 @@
                     </w:rPr>
                     <w:t>CER</w:t>
                     <w:br/>
-                    <w:t>검출 간판</w:t>
+                    <w:t>(검출된 간판)</w:t>
                   </w:r>
                 </w:p>
               </w:tc>
               <w:tc>
                 <w:tcPr>
-                  <w:tcW w:type="dxa" w:w="1286"/>
+                  <w:tcW w:type="dxa" w:w="2250"/>
                   <w:shd w:val="clear" w:color="auto" w:fill="F3F4F6"/>
                 </w:tcPr>
                 <w:p>
@@ -1592,73 +1342,7 @@
                       <w:b/>
                       <w:sz w:val="17"/>
                     </w:rPr>
-                    <w:t>line exact (%)</w:t>
-                    <w:br/>
-                    <w:t>정답 간판</w:t>
-                  </w:r>
-                </w:p>
-              </w:tc>
-              <w:tc>
-                <w:tcPr>
-                  <w:tcW w:type="dxa" w:w="1286"/>
-                  <w:shd w:val="clear" w:color="auto" w:fill="F3F4F6"/>
-                </w:tcPr>
-                <w:p>
-                  <w:pPr>
-                    <w:spacing w:after="20" w:before="0" w:line="252" w:lineRule="auto"/>
-                    <w:jc w:val="center"/>
-                  </w:pPr>
-                  <w:r>
-                    <w:rPr>
-                      <w:rFonts w:ascii="맑은 고딕" w:hAnsi="맑은 고딕" w:eastAsia="맑은 고딕"/>
-                      <w:b/>
-                      <w:sz w:val="17"/>
-                    </w:rPr>
-                    <w:t>CER</w:t>
-                    <w:br/>
-                    <w:t>정답 간판</w:t>
-                  </w:r>
-                </w:p>
-              </w:tc>
-              <w:tc>
-                <w:tcPr>
-                  <w:tcW w:type="dxa" w:w="1286"/>
-                  <w:shd w:val="clear" w:color="auto" w:fill="F3F4F6"/>
-                </w:tcPr>
-                <w:p>
-                  <w:pPr>
-                    <w:spacing w:after="20" w:before="0" w:line="252" w:lineRule="auto"/>
-                    <w:jc w:val="center"/>
-                  </w:pPr>
-                  <w:r>
-                    <w:rPr>
-                      <w:rFonts w:ascii="맑은 고딕" w:hAnsi="맑은 고딕" w:eastAsia="맑은 고딕"/>
-                      <w:b/>
-                      <w:sz w:val="17"/>
-                    </w:rPr>
-                    <w:t>태깅 정확도 (%)</w:t>
-                  </w:r>
-                </w:p>
-              </w:tc>
-              <w:tc>
-                <w:tcPr>
-                  <w:tcW w:type="dxa" w:w="1286"/>
-                  <w:shd w:val="clear" w:color="auto" w:fill="F3F4F6"/>
-                </w:tcPr>
-                <w:p>
-                  <w:pPr>
-                    <w:spacing w:after="20" w:before="0" w:line="252" w:lineRule="auto"/>
-                    <w:jc w:val="center"/>
-                  </w:pPr>
-                  <w:r>
-                    <w:rPr>
-                      <w:rFonts w:ascii="맑은 고딕" w:hAnsi="맑은 고딕" w:eastAsia="맑은 고딕"/>
-                      <w:b/>
-                      <w:sz w:val="17"/>
-                    </w:rPr>
-                    <w:t>허위 POI</w:t>
-                    <w:br/>
-                    <w:t>(FP 중)</w:t>
+                    <w:t>업종 태깅 정확도 (%)</w:t>
                   </w:r>
                 </w:p>
               </w:tc>
@@ -1666,7 +1350,7 @@
             <w:tr>
               <w:tc>
                 <w:tcPr>
-                  <w:tcW w:type="dxa" w:w="1286"/>
+                  <w:tcW w:type="dxa" w:w="2250"/>
                 </w:tcPr>
                 <w:p>
                   <w:pPr>
@@ -1684,7 +1368,7 @@
               </w:tc>
               <w:tc>
                 <w:tcPr>
-                  <w:tcW w:type="dxa" w:w="1286"/>
+                  <w:tcW w:type="dxa" w:w="2250"/>
                 </w:tcPr>
                 <w:p>
                   <w:pPr>
@@ -1703,7 +1387,7 @@
               </w:tc>
               <w:tc>
                 <w:tcPr>
-                  <w:tcW w:type="dxa" w:w="1286"/>
+                  <w:tcW w:type="dxa" w:w="2250"/>
                 </w:tcPr>
                 <w:p>
                   <w:pPr>
@@ -1722,45 +1406,7 @@
               </w:tc>
               <w:tc>
                 <w:tcPr>
-                  <w:tcW w:type="dxa" w:w="1286"/>
-                </w:tcPr>
-                <w:p>
-                  <w:pPr>
-                    <w:spacing w:after="20" w:before="0" w:line="252" w:lineRule="auto"/>
-                    <w:jc w:val="center"/>
-                  </w:pPr>
-                  <w:r>
-                    <w:rPr>
-                      <w:rFonts w:ascii="맑은 고딕" w:hAnsi="맑은 고딕" w:eastAsia="맑은 고딕"/>
-                      <w:b w:val="0"/>
-                      <w:sz w:val="17"/>
-                    </w:rPr>
-                    <w:t>83.6</w:t>
-                  </w:r>
-                </w:p>
-              </w:tc>
-              <w:tc>
-                <w:tcPr>
-                  <w:tcW w:type="dxa" w:w="1286"/>
-                </w:tcPr>
-                <w:p>
-                  <w:pPr>
-                    <w:spacing w:after="20" w:before="0" w:line="252" w:lineRule="auto"/>
-                    <w:jc w:val="center"/>
-                  </w:pPr>
-                  <w:r>
-                    <w:rPr>
-                      <w:rFonts w:ascii="맑은 고딕" w:hAnsi="맑은 고딕" w:eastAsia="맑은 고딕"/>
-                      <w:b w:val="0"/>
-                      <w:sz w:val="17"/>
-                    </w:rPr>
-                    <w:t>0.121</w:t>
-                  </w:r>
-                </w:p>
-              </w:tc>
-              <w:tc>
-                <w:tcPr>
-                  <w:tcW w:type="dxa" w:w="1286"/>
+                  <w:tcW w:type="dxa" w:w="2250"/>
                 </w:tcPr>
                 <w:p>
                   <w:pPr>
@@ -1777,30 +1423,11 @@
                   </w:r>
                 </w:p>
               </w:tc>
-              <w:tc>
-                <w:tcPr>
-                  <w:tcW w:type="dxa" w:w="1286"/>
-                </w:tcPr>
-                <w:p>
-                  <w:pPr>
-                    <w:spacing w:after="20" w:before="0" w:line="252" w:lineRule="auto"/>
-                    <w:jc w:val="center"/>
-                  </w:pPr>
-                  <w:r>
-                    <w:rPr>
-                      <w:rFonts w:ascii="맑은 고딕" w:hAnsi="맑은 고딕" w:eastAsia="맑은 고딕"/>
-                      <w:b w:val="0"/>
-                      <w:sz w:val="17"/>
-                    </w:rPr>
-                    <w:t>69 / 96</w:t>
-                  </w:r>
-                </w:p>
-              </w:tc>
             </w:tr>
             <w:tr>
               <w:tc>
                 <w:tcPr>
-                  <w:tcW w:type="dxa" w:w="1286"/>
+                  <w:tcW w:type="dxa" w:w="2250"/>
                 </w:tcPr>
                 <w:p>
                   <w:pPr>
@@ -1818,7 +1445,7 @@
               </w:tc>
               <w:tc>
                 <w:tcPr>
-                  <w:tcW w:type="dxa" w:w="1286"/>
+                  <w:tcW w:type="dxa" w:w="2250"/>
                 </w:tcPr>
                 <w:p>
                   <w:pPr>
@@ -1837,7 +1464,7 @@
               </w:tc>
               <w:tc>
                 <w:tcPr>
-                  <w:tcW w:type="dxa" w:w="1286"/>
+                  <w:tcW w:type="dxa" w:w="2250"/>
                 </w:tcPr>
                 <w:p>
                   <w:pPr>
@@ -1856,45 +1483,7 @@
               </w:tc>
               <w:tc>
                 <w:tcPr>
-                  <w:tcW w:type="dxa" w:w="1286"/>
-                </w:tcPr>
-                <w:p>
-                  <w:pPr>
-                    <w:spacing w:after="20" w:before="0" w:line="252" w:lineRule="auto"/>
-                    <w:jc w:val="center"/>
-                  </w:pPr>
-                  <w:r>
-                    <w:rPr>
-                      <w:rFonts w:ascii="맑은 고딕" w:hAnsi="맑은 고딕" w:eastAsia="맑은 고딕"/>
-                      <w:b w:val="0"/>
-                      <w:sz w:val="17"/>
-                    </w:rPr>
-                    <w:t>82.4</w:t>
-                  </w:r>
-                </w:p>
-              </w:tc>
-              <w:tc>
-                <w:tcPr>
-                  <w:tcW w:type="dxa" w:w="1286"/>
-                </w:tcPr>
-                <w:p>
-                  <w:pPr>
-                    <w:spacing w:after="20" w:before="0" w:line="252" w:lineRule="auto"/>
-                    <w:jc w:val="center"/>
-                  </w:pPr>
-                  <w:r>
-                    <w:rPr>
-                      <w:rFonts w:ascii="맑은 고딕" w:hAnsi="맑은 고딕" w:eastAsia="맑은 고딕"/>
-                      <w:b w:val="0"/>
-                      <w:sz w:val="17"/>
-                    </w:rPr>
-                    <w:t>0.133</w:t>
-                  </w:r>
-                </w:p>
-              </w:tc>
-              <w:tc>
-                <w:tcPr>
-                  <w:tcW w:type="dxa" w:w="1286"/>
+                  <w:tcW w:type="dxa" w:w="2250"/>
                 </w:tcPr>
                 <w:p>
                   <w:pPr>
@@ -1908,25 +1497,6 @@
                       <w:sz w:val="17"/>
                     </w:rPr>
                     <w:t>85.5</w:t>
-                  </w:r>
-                </w:p>
-              </w:tc>
-              <w:tc>
-                <w:tcPr>
-                  <w:tcW w:type="dxa" w:w="1286"/>
-                </w:tcPr>
-                <w:p>
-                  <w:pPr>
-                    <w:spacing w:after="20" w:before="0" w:line="252" w:lineRule="auto"/>
-                    <w:jc w:val="center"/>
-                  </w:pPr>
-                  <w:r>
-                    <w:rPr>
-                      <w:rFonts w:ascii="맑은 고딕" w:hAnsi="맑은 고딕" w:eastAsia="맑은 고딕"/>
-                      <w:b w:val="0"/>
-                      <w:sz w:val="17"/>
-                    </w:rPr>
-                    <w:t>67 / 96</w:t>
                   </w:r>
                 </w:p>
               </w:tc>

</xml_diff>